<commit_message>
Fix Library/KB schema 500s and add paid purchase unlock flow.
Migrate missing service columns on Vercel, align catalog response fields for frontend filters, replace free paid download with purchase + payment complete, and document the Buy to My Documents contract.

Co-authored-by: Cursor <cursoragent@cursor.com>
</commit_message>
<xml_diff>
--- a/docs/Library_KnowledgeBank_Documents_API.docx
+++ b/docs/Library_KnowledgeBank_Documents_API.docx
@@ -7,17 +7,17 @@
         <w:pStyle w:val="Title"/>
       </w:pPr>
       <w:r>
-        <w:t>NexusLexis — Library, Knowledge Bank &amp; My Documents</w:t>
+        <w:t>NexusLexis — Library, Knowledge Bank &amp; My Documents (API Contract)</w:t>
       </w:r>
     </w:p>
     <w:p>
       <w:r>
-        <w:t xml:space="preserve">**Document ID:** NL-DOC-LIB-001  </w:t>
+        <w:t xml:space="preserve">**Document ID:** NL-DOC-LIB-002  </w:t>
       </w:r>
     </w:p>
     <w:p>
       <w:r>
-        <w:t xml:space="preserve">**Version:** 1.0  </w:t>
+        <w:t xml:space="preserve">**Version:** 2.0  </w:t>
       </w:r>
     </w:p>
     <w:p>
@@ -27,12 +27,12 @@
     </w:p>
     <w:p>
       <w:r>
-        <w:t xml:space="preserve">**Audience:** Frontend / Admin UI  </w:t>
+        <w:t xml:space="preserve">**Replaces:** NL-DOC-LIB-001 (download-without-payment flow removed)  </w:t>
       </w:r>
     </w:p>
     <w:p>
       <w:r>
-        <w:t>**Base URL (Main API):** `https://nexus-lexis-backend-ql8w.vercel.app/api/v2`</w:t>
+        <w:t>**Base URL:** `https://nexus-lexis-backend-ql8w.vercel.app/api/v2`</w:t>
       </w:r>
     </w:p>
     <w:p>
@@ -54,42 +54,7 @@
         <w:pStyle w:val="Heading1"/>
       </w:pPr>
       <w:r>
-        <w:t>1. Overview</w:t>
-      </w:r>
-    </w:p>
-    <w:p>
-      <w:r>
-        <w:t>There are **two template types**:</w:t>
-      </w:r>
-    </w:p>
-    <w:p>
-      <w:r>
-        <w:t>| Type | `accessType` | UI surface | Behavior |</w:t>
-      </w:r>
-    </w:p>
-    <w:p>
-      <w:r>
-        <w:t>|------|--------------|------------|----------|</w:t>
-      </w:r>
-    </w:p>
-    <w:p>
-      <w:r>
-        <w:t>| **Public** | `public` | Knowledge Bank | Free browse + download. Does **not** go to My Documents. |</w:t>
-      </w:r>
-    </w:p>
-    <w:p>
-      <w:r>
-        <w:t>| **Paid** | `paid` | Client Library | Client download → saved to **My Documents**. Can also place a custom order. |</w:t>
-      </w:r>
-    </w:p>
-    <w:p>
-      <w:r>
-        <w:t>Admin uploads templates once and sets `accessType`. Clients consume them from the matching catalog.</w:t>
-      </w:r>
-    </w:p>
-    <w:p>
-      <w:r>
-        <w:t>Admin uploads template (accessType)</w:t>
+        <w:t>1. Product rules</w:t>
       </w:r>
     </w:p>
     <w:p>
@@ -98,7 +63,7 @@
           <w:rFonts w:ascii="Consolas" w:hAnsi="Consolas"/>
           <w:sz w:val="18"/>
         </w:rPr>
-        <w:t xml:space="preserve">        │</w:t>
+        <w:t>| Type | `accessType` | UI | Rules |</w:t>
       </w:r>
     </w:p>
     <w:p>
@@ -107,7 +72,7 @@
           <w:rFonts w:ascii="Consolas" w:hAnsi="Consolas"/>
           <w:sz w:val="18"/>
         </w:rPr>
-        <w:t xml:space="preserve">        ├── public ──► Knowledge Bank ──► free download</w:t>
+        <w:t>|------|--------------|----|--------|</w:t>
       </w:r>
     </w:p>
     <w:p>
@@ -116,7 +81,7 @@
           <w:rFonts w:ascii="Consolas" w:hAnsi="Consolas"/>
           <w:sz w:val="18"/>
         </w:rPr>
-        <w:t xml:space="preserve">        │</w:t>
+        <w:t>| Public | `public` | Knowledge Bank | No login. Free device download. **Never** My Documents. |</w:t>
       </w:r>
     </w:p>
     <w:p>
@@ -125,70 +90,12 @@
           <w:rFonts w:ascii="Consolas" w:hAnsi="Consolas"/>
           <w:sz w:val="18"/>
         </w:rPr>
-        <w:t xml:space="preserve">        └── paid ────► Client Library</w:t>
+        <w:t>| Paid | `paid` | Client Library | Login → **Buy** → **Pay** → unlock in My Documents → download **only** from My Documents. |</w:t>
       </w:r>
     </w:p>
     <w:p>
       <w:r>
-        <w:rPr>
-          <w:rFonts w:ascii="Consolas" w:hAnsi="Consolas"/>
-          <w:sz w:val="18"/>
-        </w:rPr>
-        <w:t xml:space="preserve">                            │</w:t>
-      </w:r>
-    </w:p>
-    <w:p>
-      <w:r>
-        <w:rPr>
-          <w:rFonts w:ascii="Consolas" w:hAnsi="Consolas"/>
-          <w:sz w:val="18"/>
-        </w:rPr>
-        <w:t xml:space="preserve">                            ▼</w:t>
-      </w:r>
-    </w:p>
-    <w:p>
-      <w:r>
-        <w:rPr>
-          <w:rFonts w:ascii="Consolas" w:hAnsi="Consolas"/>
-          <w:sz w:val="18"/>
-        </w:rPr>
-        <w:t xml:space="preserve">              POST .../library/templates/:slug/download</w:t>
-      </w:r>
-    </w:p>
-    <w:p>
-      <w:r>
-        <w:rPr>
-          <w:rFonts w:ascii="Consolas" w:hAnsi="Consolas"/>
-          <w:sz w:val="18"/>
-        </w:rPr>
-        <w:t xml:space="preserve">                            │</w:t>
-      </w:r>
-    </w:p>
-    <w:p>
-      <w:r>
-        <w:rPr>
-          <w:rFonts w:ascii="Consolas" w:hAnsi="Consolas"/>
-          <w:sz w:val="18"/>
-        </w:rPr>
-        <w:t xml:space="preserve">                            ▼</w:t>
-      </w:r>
-    </w:p>
-    <w:p>
-      <w:r>
-        <w:rPr>
-          <w:rFonts w:ascii="Consolas" w:hAnsi="Consolas"/>
-          <w:sz w:val="18"/>
-        </w:rPr>
-        <w:t xml:space="preserve">                      My Documents</w:t>
-      </w:r>
-    </w:p>
-    <w:p>
-      <w:r>
-        <w:rPr>
-          <w:rFonts w:ascii="Consolas" w:hAnsi="Consolas"/>
-          <w:sz w:val="18"/>
-        </w:rPr>
-        <w:t xml:space="preserve">                   GET /documents</w:t>
+        <w:t>**Removed:** `POST /library/templates/:slug/download` no longer unlocks paid files without payment (returns `410`).</w:t>
       </w:r>
     </w:p>
     <w:p>
@@ -201,25 +108,50 @@
         <w:pStyle w:val="Heading1"/>
       </w:pPr>
       <w:r>
-        <w:t>2. Admin APIs (new)</w:t>
+        <w:t>2. Target purchase flow (paid Library)</w:t>
       </w:r>
     </w:p>
     <w:p>
       <w:r>
-        <w:t xml:space="preserve">**Auth:** Bearer token — role must be `admin`  </w:t>
+        <w:t>1. `GET /library/catalog` — show paid docs (`owned` when Bearer present).</w:t>
       </w:r>
     </w:p>
     <w:p>
       <w:r>
-        <w:t>Demo: `admin@nexuslexis.law` / `admin123`</w:t>
+        <w:t>2. `POST /library/templates/:slug/purchase` — create pending purchase.</w:t>
+      </w:r>
+    </w:p>
+    <w:p>
+      <w:r>
+        <w:t>3. `POST /library/purchases/:orderNumber/complete` — mark paid / unlock.</w:t>
+      </w:r>
+    </w:p>
+    <w:p>
+      <w:r>
+        <w:t>4. `GET /documents` — purchased doc appears.</w:t>
+      </w:r>
+    </w:p>
+    <w:p>
+      <w:r>
+        <w:t>5. `GET /documents/:orderNumber/download` — download file (completed only).</w:t>
+      </w:r>
+    </w:p>
+    <w:p>
+      <w:r>
+        <w:t>Knowledge Bank stays: catalog → free `GET .../download` (no My Documents).</w:t>
+      </w:r>
+    </w:p>
+    <w:p>
+      <w:r>
+        <w:t>---</w:t>
       </w:r>
     </w:p>
     <w:p>
       <w:pPr>
-        <w:pStyle w:val="Heading2"/>
+        <w:pStyle w:val="Heading1"/>
       </w:pPr>
       <w:r>
-        <w:t>2.1 List all templates (admin)</w:t>
+        <w:t>3. Response field contract (templates)</w:t>
       </w:r>
     </w:p>
     <w:p>
@@ -228,7 +160,7 @@
           <w:rFonts w:ascii="Consolas" w:hAnsi="Consolas"/>
           <w:sz w:val="18"/>
         </w:rPr>
-        <w:t>GET /admin/library/catalog</w:t>
+        <w:t>| FE need | API field(s) |</w:t>
       </w:r>
     </w:p>
     <w:p>
@@ -237,7 +169,7 @@
           <w:rFonts w:ascii="Consolas" w:hAnsi="Consolas"/>
           <w:sz w:val="18"/>
         </w:rPr>
-        <w:t>GET /admin/library/catalog?accessType=public</w:t>
+        <w:t>|---------|----------------|</w:t>
       </w:r>
     </w:p>
     <w:p>
@@ -246,20 +178,7 @@
           <w:rFonts w:ascii="Consolas" w:hAnsi="Consolas"/>
           <w:sz w:val="18"/>
         </w:rPr>
-        <w:t>GET /admin/library/catalog?accessType=paid</w:t>
-      </w:r>
-    </w:p>
-    <w:p>
-      <w:r>
-        <w:t>Includes inactive templates. Optional `accessType` filter.</w:t>
-      </w:r>
-    </w:p>
-    <w:p>
-      <w:pPr>
-        <w:pStyle w:val="Heading2"/>
-      </w:pPr>
-      <w:r>
-        <w:t>2.2 Create category</w:t>
+        <w:t>| Route key | `id`, `slug` |</w:t>
       </w:r>
     </w:p>
     <w:p>
@@ -268,12 +187,120 @@
           <w:rFonts w:ascii="Consolas" w:hAnsi="Consolas"/>
           <w:sz w:val="18"/>
         </w:rPr>
-        <w:t>POST /admin/library/categories</w:t>
+        <w:t>| Title | `name`, `title` |</w:t>
       </w:r>
     </w:p>
     <w:p>
       <w:r>
-        <w:t>Content-Type: application/json</w:t>
+        <w:rPr>
+          <w:rFonts w:ascii="Consolas" w:hAnsi="Consolas"/>
+          <w:sz w:val="18"/>
+        </w:rPr>
+        <w:t>| Code | `code` (e.g. `NL FAM 04`) |</w:t>
+      </w:r>
+    </w:p>
+    <w:p>
+      <w:r>
+        <w:rPr>
+          <w:rFonts w:ascii="Consolas" w:hAnsi="Consolas"/>
+          <w:sz w:val="18"/>
+        </w:rPr>
+        <w:t>| Category filter | `category`, `categorySlug`, `categoryName` |</w:t>
+      </w:r>
+    </w:p>
+    <w:p>
+      <w:r>
+        <w:rPr>
+          <w:rFonts w:ascii="Consolas" w:hAnsi="Consolas"/>
+          <w:sz w:val="18"/>
+        </w:rPr>
+        <w:t>| Block filter | `block` (e.g. Petitions / Notices / Agreements) |</w:t>
+      </w:r>
+    </w:p>
+    <w:p>
+      <w:r>
+        <w:rPr>
+          <w:rFonts w:ascii="Consolas" w:hAnsi="Consolas"/>
+          <w:sz w:val="18"/>
+        </w:rPr>
+        <w:t>| Language filter | `lang`, `language` |</w:t>
+      </w:r>
+    </w:p>
+    <w:p>
+      <w:r>
+        <w:rPr>
+          <w:rFonts w:ascii="Consolas" w:hAnsi="Consolas"/>
+          <w:sz w:val="18"/>
+        </w:rPr>
+        <w:t>| Price / Buy CTA | `price`, `priceLabel` (`0` / Free for public) |</w:t>
+      </w:r>
+    </w:p>
+    <w:p>
+      <w:r>
+        <w:rPr>
+          <w:rFonts w:ascii="Consolas" w:hAnsi="Consolas"/>
+          <w:sz w:val="18"/>
+        </w:rPr>
+        <w:t>| Copy | `description` |</w:t>
+      </w:r>
+    </w:p>
+    <w:p>
+      <w:r>
+        <w:rPr>
+          <w:rFonts w:ascii="Consolas" w:hAnsi="Consolas"/>
+          <w:sz w:val="18"/>
+        </w:rPr>
+        <w:t>| Attribution | `lawyer`, `author` |</w:t>
+      </w:r>
+    </w:p>
+    <w:p>
+      <w:r>
+        <w:rPr>
+          <w:rFonts w:ascii="Consolas" w:hAnsi="Consolas"/>
+          <w:sz w:val="18"/>
+        </w:rPr>
+        <w:t>| Version | `version` |</w:t>
+      </w:r>
+    </w:p>
+    <w:p>
+      <w:r>
+        <w:rPr>
+          <w:rFonts w:ascii="Consolas" w:hAnsi="Consolas"/>
+          <w:sz w:val="18"/>
+        </w:rPr>
+        <w:t>| Routing | `accessType` (`public` \| `paid`) |</w:t>
+      </w:r>
+    </w:p>
+    <w:p>
+      <w:r>
+        <w:rPr>
+          <w:rFonts w:ascii="Consolas" w:hAnsi="Consolas"/>
+          <w:sz w:val="18"/>
+        </w:rPr>
+        <w:t>| File state | `hasTemplateFile` |</w:t>
+      </w:r>
+    </w:p>
+    <w:p>
+      <w:r>
+        <w:rPr>
+          <w:rFonts w:ascii="Consolas" w:hAnsi="Consolas"/>
+          <w:sz w:val="18"/>
+        </w:rPr>
+        <w:t>| Ownership | `owned`, `ownedOrderNumber` |</w:t>
+      </w:r>
+    </w:p>
+    <w:p>
+      <w:r>
+        <w:rPr>
+          <w:rFonts w:ascii="Consolas" w:hAnsi="Consolas"/>
+          <w:sz w:val="18"/>
+        </w:rPr>
+        <w:t>| Actions | `purchaseUrl`, `sampleDownloadUrl`, `downloadUrl` |</w:t>
+      </w:r>
+    </w:p>
+    <w:p>
+      <w:r>
+        <w:t>Catalog also returns:</w:t>
       </w:r>
     </w:p>
     <w:p>
@@ -287,27 +314,42 @@
     </w:p>
     <w:p>
       <w:r>
-        <w:t xml:space="preserve">  "name": "Knowledge Bank",</w:t>
+        <w:t xml:space="preserve">  "accessType": "paid",</w:t>
       </w:r>
     </w:p>
     <w:p>
       <w:r>
-        <w:t xml:space="preserve">  "slug": "knowledge-bank",</w:t>
+        <w:t xml:space="preserve">  "categories": [...],</w:t>
       </w:r>
     </w:p>
     <w:p>
       <w:r>
-        <w:t xml:space="preserve">  "description": "Free public templates",</w:t>
+        <w:t xml:space="preserve">  "templateCount": 9,</w:t>
       </w:r>
     </w:p>
     <w:p>
       <w:r>
-        <w:t xml:space="preserve">  "icon": "book-open",</w:t>
+        <w:t xml:space="preserve">  "filters": {</w:t>
       </w:r>
     </w:p>
     <w:p>
       <w:r>
-        <w:t xml:space="preserve">  "displayOrder": 4</w:t>
+        <w:t xml:space="preserve">    "categories": ["corporate-business", "..."],</w:t>
+      </w:r>
+    </w:p>
+    <w:p>
+      <w:r>
+        <w:t xml:space="preserve">    "blocks": ["Agreements", "Notices", "Petitions"],</w:t>
+      </w:r>
+    </w:p>
+    <w:p>
+      <w:r>
+        <w:t xml:space="preserve">    "languages": ["English"]</w:t>
+      </w:r>
+    </w:p>
+    <w:p>
+      <w:r>
+        <w:t xml:space="preserve">  }</w:t>
       </w:r>
     </w:p>
     <w:p>
@@ -316,280 +358,8 @@
       </w:r>
     </w:p>
     <w:p>
-      <w:pPr>
-        <w:pStyle w:val="Heading2"/>
-      </w:pPr>
       <w:r>
-        <w:t>2.3 Create template (upload)</w:t>
-      </w:r>
-    </w:p>
-    <w:p>
-      <w:r>
-        <w:rPr>
-          <w:rFonts w:ascii="Consolas" w:hAnsi="Consolas"/>
-          <w:sz w:val="18"/>
-        </w:rPr>
-        <w:t>POST /admin/library/templates</w:t>
-      </w:r>
-    </w:p>
-    <w:p>
-      <w:r>
-        <w:t>Content-Type: multipart/form-data</w:t>
-      </w:r>
-    </w:p>
-    <w:p>
-      <w:r>
-        <w:t>| Field | Required | Notes |</w:t>
-      </w:r>
-    </w:p>
-    <w:p>
-      <w:r>
-        <w:t>|-------|----------|--------|</w:t>
-      </w:r>
-    </w:p>
-    <w:p>
-      <w:r>
-        <w:t>| `name` | yes | Display name |</w:t>
-      </w:r>
-    </w:p>
-    <w:p>
-      <w:r>
-        <w:t>| `accessType` | yes* | `public` or `paid` (*defaults to `paid`) |</w:t>
-      </w:r>
-    </w:p>
-    <w:p>
-      <w:r>
-        <w:t>| `categorySlug` | yes* | e.g. `document-services` (*or `categoryId`) |</w:t>
-      </w:r>
-    </w:p>
-    <w:p>
-      <w:r>
-        <w:t>| `price` | paid only | Must be `&gt; 0` for paid; public forced to `0` |</w:t>
-      </w:r>
-    </w:p>
-    <w:p>
-      <w:r>
-        <w:t>| `deliveryDays` | no | Default `7` |</w:t>
-      </w:r>
-    </w:p>
-    <w:p>
-      <w:r>
-        <w:t>| `description` | no | |</w:t>
-      </w:r>
-    </w:p>
-    <w:p>
-      <w:r>
-        <w:t>| `slug` | no | Auto-generated from name |</w:t>
-      </w:r>
-    </w:p>
-    <w:p>
-      <w:r>
-        <w:t>| `intakeSchema` | no | JSON string |</w:t>
-      </w:r>
-    </w:p>
-    <w:p>
-      <w:r>
-        <w:t>| `file` | no | PDF / DOC / DOCX / TXT / PNG / JPG (max 5MB) |</w:t>
-      </w:r>
-    </w:p>
-    <w:p>
-      <w:r>
-        <w:t>**Public example**</w:t>
-      </w:r>
-    </w:p>
-    <w:p>
-      <w:r>
-        <w:rPr>
-          <w:rFonts w:ascii="Consolas" w:hAnsi="Consolas"/>
-          <w:sz w:val="18"/>
-        </w:rPr>
-        <w:t>name=Sample Affidavit Guide</w:t>
-      </w:r>
-    </w:p>
-    <w:p>
-      <w:r>
-        <w:rPr>
-          <w:rFonts w:ascii="Consolas" w:hAnsi="Consolas"/>
-          <w:sz w:val="18"/>
-        </w:rPr>
-        <w:t>accessType=public</w:t>
-      </w:r>
-    </w:p>
-    <w:p>
-      <w:r>
-        <w:rPr>
-          <w:rFonts w:ascii="Consolas" w:hAnsi="Consolas"/>
-          <w:sz w:val="18"/>
-        </w:rPr>
-        <w:t>categorySlug=knowledge-bank</w:t>
-      </w:r>
-    </w:p>
-    <w:p>
-      <w:r>
-        <w:t>description=Free guide for Knowledge Bank</w:t>
-      </w:r>
-    </w:p>
-    <w:p>
-      <w:r>
-        <w:rPr>
-          <w:rFonts w:ascii="Consolas" w:hAnsi="Consolas"/>
-          <w:sz w:val="18"/>
-        </w:rPr>
-        <w:t>file=&lt;guide.pdf&gt;</w:t>
-      </w:r>
-    </w:p>
-    <w:p>
-      <w:r>
-        <w:t>**Paid example**</w:t>
-      </w:r>
-    </w:p>
-    <w:p>
-      <w:r>
-        <w:rPr>
-          <w:rFonts w:ascii="Consolas" w:hAnsi="Consolas"/>
-          <w:sz w:val="18"/>
-        </w:rPr>
-        <w:t>name=NDA Agreement</w:t>
-      </w:r>
-    </w:p>
-    <w:p>
-      <w:r>
-        <w:rPr>
-          <w:rFonts w:ascii="Consolas" w:hAnsi="Consolas"/>
-          <w:sz w:val="18"/>
-        </w:rPr>
-        <w:t>accessType=paid</w:t>
-      </w:r>
-    </w:p>
-    <w:p>
-      <w:r>
-        <w:rPr>
-          <w:rFonts w:ascii="Consolas" w:hAnsi="Consolas"/>
-          <w:sz w:val="18"/>
-        </w:rPr>
-        <w:t>categorySlug=document-services</w:t>
-      </w:r>
-    </w:p>
-    <w:p>
-      <w:r>
-        <w:rPr>
-          <w:rFonts w:ascii="Consolas" w:hAnsi="Consolas"/>
-          <w:sz w:val="18"/>
-        </w:rPr>
-        <w:t>price=15000</w:t>
-      </w:r>
-    </w:p>
-    <w:p>
-      <w:r>
-        <w:t>deliveryDays=5</w:t>
-      </w:r>
-    </w:p>
-    <w:p>
-      <w:r>
-        <w:t>description=Standard NDA for startups</w:t>
-      </w:r>
-    </w:p>
-    <w:p>
-      <w:r>
-        <w:rPr>
-          <w:rFonts w:ascii="Consolas" w:hAnsi="Consolas"/>
-          <w:sz w:val="18"/>
-        </w:rPr>
-        <w:t>file=&lt;nda.pdf&gt;</w:t>
-      </w:r>
-    </w:p>
-    <w:p>
-      <w:r>
-        <w:t>**Response (201):** `{ "template": { id, name, slug, accessType, listing, price, ... } }`</w:t>
-      </w:r>
-    </w:p>
-    <w:p>
-      <w:r>
-        <w:t>Template fields of note:</w:t>
-      </w:r>
-    </w:p>
-    <w:p>
-      <w:r>
-        <w:t>| Field | Meaning |</w:t>
-      </w:r>
-    </w:p>
-    <w:p>
-      <w:r>
-        <w:t>|-------|---------|</w:t>
-      </w:r>
-    </w:p>
-    <w:p>
-      <w:r>
-        <w:t>| `accessType` | `public` \| `paid` |</w:t>
-      </w:r>
-    </w:p>
-    <w:p>
-      <w:r>
-        <w:t>| `listing` | `knowledge_bank` \| `library` |</w:t>
-      </w:r>
-    </w:p>
-    <w:p>
-      <w:r>
-        <w:t>| `isFree` / `isPaid` | Booleans |</w:t>
-      </w:r>
-    </w:p>
-    <w:p>
-      <w:r>
-        <w:t>| `hasTemplateFile` | Admin uploaded a file |</w:t>
-      </w:r>
-    </w:p>
-    <w:p>
-      <w:r>
-        <w:t>| `downloadUrl` | Client-facing download path (see below) |</w:t>
-      </w:r>
-    </w:p>
-    <w:p>
-      <w:pPr>
-        <w:pStyle w:val="Heading2"/>
-      </w:pPr>
-      <w:r>
-        <w:t>2.4 Update template</w:t>
-      </w:r>
-    </w:p>
-    <w:p>
-      <w:r>
-        <w:rPr>
-          <w:rFonts w:ascii="Consolas" w:hAnsi="Consolas"/>
-          <w:sz w:val="18"/>
-        </w:rPr>
-        <w:t>PUT /admin/library/templates/:idOrSlug</w:t>
-      </w:r>
-    </w:p>
-    <w:p>
-      <w:r>
-        <w:t>Content-Type: multipart/form-data</w:t>
-      </w:r>
-    </w:p>
-    <w:p>
-      <w:r>
-        <w:t>Same fields as create (all optional). Use `clearFile=true` to remove attached file. Change `accessType` to move between Knowledge Bank and Library.</w:t>
-      </w:r>
-    </w:p>
-    <w:p>
-      <w:pPr>
-        <w:pStyle w:val="Heading2"/>
-      </w:pPr>
-      <w:r>
-        <w:t>2.5 Deactivate template</w:t>
-      </w:r>
-    </w:p>
-    <w:p>
-      <w:r>
-        <w:rPr>
-          <w:rFonts w:ascii="Consolas" w:hAnsi="Consolas"/>
-          <w:sz w:val="18"/>
-        </w:rPr>
-        <w:t>DELETE /admin/library/templates/:idOrSlug</w:t>
-      </w:r>
-    </w:p>
-    <w:p>
-      <w:r>
-        <w:t>Soft-deletes (`isActive=false`). Hidden from public/client catalogs.</w:t>
+        <w:t>Query params on catalogs: `category`, `search`, `block`, `language` (or `lang`).</w:t>
       </w:r>
     </w:p>
     <w:p>
@@ -602,47 +372,97 @@
         <w:pStyle w:val="Heading1"/>
       </w:pPr>
       <w:r>
-        <w:t>3. Knowledge Bank APIs (public templates)</w:t>
+        <w:t>4. My Documents field contract</w:t>
       </w:r>
     </w:p>
     <w:p>
       <w:r>
-        <w:t>No auth required.</w:t>
+        <w:rPr>
+          <w:rFonts w:ascii="Consolas" w:hAnsi="Consolas"/>
+          <w:sz w:val="18"/>
+        </w:rPr>
+        <w:t>| FE need | API field(s) |</w:t>
       </w:r>
     </w:p>
     <w:p>
       <w:r>
-        <w:t>| Method | Path | Purpose |</w:t>
+        <w:rPr>
+          <w:rFonts w:ascii="Consolas" w:hAnsi="Consolas"/>
+          <w:sz w:val="18"/>
+        </w:rPr>
+        <w:t>|---------|----------------|</w:t>
       </w:r>
     </w:p>
     <w:p>
       <w:r>
-        <w:t>|--------|------|---------|</w:t>
+        <w:rPr>
+          <w:rFonts w:ascii="Consolas" w:hAnsi="Consolas"/>
+          <w:sz w:val="18"/>
+        </w:rPr>
+        <w:t>| Key | `orderNumber` / `id` |</w:t>
       </w:r>
     </w:p>
     <w:p>
       <w:r>
-        <w:t>| GET | `/knowledge-bank/catalog` | List free templates (`accessType=public`) |</w:t>
+        <w:rPr>
+          <w:rFonts w:ascii="Consolas" w:hAnsi="Consolas"/>
+          <w:sz w:val="18"/>
+        </w:rPr>
+        <w:t>| Title | `templateName`, `title` |</w:t>
       </w:r>
     </w:p>
     <w:p>
       <w:r>
-        <w:t>| GET | `/knowledge-bank/templates/:slug` | Template detail |</w:t>
+        <w:rPr>
+          <w:rFonts w:ascii="Consolas" w:hAnsi="Consolas"/>
+          <w:sz w:val="18"/>
+        </w:rPr>
+        <w:t>| Status | `status`, `statusKey` (`pending_payment` \| `completed` \| …) |</w:t>
       </w:r>
     </w:p>
     <w:p>
       <w:r>
-        <w:t>| GET | `/knowledge-bank/templates/:slug/download` | Download free file |</w:t>
+        <w:rPr>
+          <w:rFonts w:ascii="Consolas" w:hAnsi="Consolas"/>
+          <w:sz w:val="18"/>
+        </w:rPr>
+        <w:t>| Source | `source` = `library_purchase` (preferred) |</w:t>
       </w:r>
     </w:p>
     <w:p>
       <w:r>
-        <w:t>Query on catalog: `?category=`, `?search=`</w:t>
+        <w:rPr>
+          <w:rFonts w:ascii="Consolas" w:hAnsi="Consolas"/>
+          <w:sz w:val="18"/>
+        </w:rPr>
+        <w:t>| Dates | `purchasedAt`, `createdAt` |</w:t>
       </w:r>
     </w:p>
     <w:p>
       <w:r>
-        <w:t>**Note:** Knowledge Bank downloads are **not** written to My Documents.</w:t>
+        <w:rPr>
+          <w:rFonts w:ascii="Consolas" w:hAnsi="Consolas"/>
+          <w:sz w:val="18"/>
+        </w:rPr>
+        <w:t>| Receipt | `price`, `totalPaid` |</w:t>
+      </w:r>
+    </w:p>
+    <w:p>
+      <w:r>
+        <w:rPr>
+          <w:rFonts w:ascii="Consolas" w:hAnsi="Consolas"/>
+          <w:sz w:val="18"/>
+        </w:rPr>
+        <w:t>| Download | `hasDownload`, `downloadUrl` (only when completed + ready) |</w:t>
+      </w:r>
+    </w:p>
+    <w:p>
+      <w:r>
+        <w:rPr>
+          <w:rFonts w:ascii="Consolas" w:hAnsi="Consolas"/>
+          <w:sz w:val="18"/>
+        </w:rPr>
+        <w:t>| Category | `category`, `categorySlug`, `categoryName` |</w:t>
       </w:r>
     </w:p>
     <w:p>
@@ -655,45 +475,7 @@
         <w:pStyle w:val="Heading1"/>
       </w:pPr>
       <w:r>
-        <w:t>4. Client Library APIs (paid templates)</w:t>
-      </w:r>
-    </w:p>
-    <w:p>
-      <w:r>
-        <w:t>| Method | Path | Auth | Purpose |</w:t>
-      </w:r>
-    </w:p>
-    <w:p>
-      <w:r>
-        <w:t>|--------|------|------|---------|</w:t>
-      </w:r>
-    </w:p>
-    <w:p>
-      <w:r>
-        <w:t>| GET | `/library/catalog` | No | List **paid** templates only |</w:t>
-      </w:r>
-    </w:p>
-    <w:p>
-      <w:r>
-        <w:t>| GET | `/library/templates/:slug` | No | Paid template detail |</w:t>
-      </w:r>
-    </w:p>
-    <w:p>
-      <w:r>
-        <w:t>| GET | `/library/templates/:slug/sample` | No | Preview sample file (if uploaded) |</w:t>
-      </w:r>
-    </w:p>
-    <w:p>
-      <w:r>
-        <w:t>| **POST** | `/library/templates/:slug/download` | **Client JWT** | **Download → save to My Documents** |</w:t>
-      </w:r>
-    </w:p>
-    <w:p>
-      <w:pPr>
-        <w:pStyle w:val="Heading2"/>
-      </w:pPr>
-      <w:r>
-        <w:t>4.1 Download paid template → My Documents (new)</w:t>
+        <w:t>5. Public Knowledge Bank</w:t>
       </w:r>
     </w:p>
     <w:p>
@@ -702,17 +484,215 @@
           <w:rFonts w:ascii="Consolas" w:hAnsi="Consolas"/>
           <w:sz w:val="18"/>
         </w:rPr>
-        <w:t>POST /library/templates/:slug/download</w:t>
+        <w:t>| Method | Path | Auth |</w:t>
       </w:r>
     </w:p>
     <w:p>
       <w:r>
-        <w:t>Authorization: Bearer &lt;client_access_token&gt;</w:t>
+        <w:rPr>
+          <w:rFonts w:ascii="Consolas" w:hAnsi="Consolas"/>
+          <w:sz w:val="18"/>
+        </w:rPr>
+        <w:t>|--------|------|------|</w:t>
       </w:r>
     </w:p>
     <w:p>
       <w:r>
-        <w:t>**Response (201)**</w:t>
+        <w:rPr>
+          <w:rFonts w:ascii="Consolas" w:hAnsi="Consolas"/>
+          <w:sz w:val="18"/>
+        </w:rPr>
+        <w:t>| GET | `/knowledge-bank/catalog` | No |</w:t>
+      </w:r>
+    </w:p>
+    <w:p>
+      <w:r>
+        <w:rPr>
+          <w:rFonts w:ascii="Consolas" w:hAnsi="Consolas"/>
+          <w:sz w:val="18"/>
+        </w:rPr>
+        <w:t>| GET | `/knowledge-bank/templates/:slug` | No |</w:t>
+      </w:r>
+    </w:p>
+    <w:p>
+      <w:r>
+        <w:rPr>
+          <w:rFonts w:ascii="Consolas" w:hAnsi="Consolas"/>
+          <w:sz w:val="18"/>
+        </w:rPr>
+        <w:t>| GET | `/knowledge-bank/templates/:slug/download` | No |</w:t>
+      </w:r>
+    </w:p>
+    <w:p>
+      <w:r>
+        <w:t>Returns **only** `accessType=public` and active templates.</w:t>
+      </w:r>
+    </w:p>
+    <w:p>
+      <w:r>
+        <w:t>---</w:t>
+      </w:r>
+    </w:p>
+    <w:p>
+      <w:pPr>
+        <w:pStyle w:val="Heading1"/>
+      </w:pPr>
+      <w:r>
+        <w:t>6. Client Library (paid)</w:t>
+      </w:r>
+    </w:p>
+    <w:p>
+      <w:r>
+        <w:rPr>
+          <w:rFonts w:ascii="Consolas" w:hAnsi="Consolas"/>
+          <w:sz w:val="18"/>
+        </w:rPr>
+        <w:t>| Method | Path | Auth |</w:t>
+      </w:r>
+    </w:p>
+    <w:p>
+      <w:r>
+        <w:rPr>
+          <w:rFonts w:ascii="Consolas" w:hAnsi="Consolas"/>
+          <w:sz w:val="18"/>
+        </w:rPr>
+        <w:t>|--------|------|------|</w:t>
+      </w:r>
+    </w:p>
+    <w:p>
+      <w:r>
+        <w:rPr>
+          <w:rFonts w:ascii="Consolas" w:hAnsi="Consolas"/>
+          <w:sz w:val="18"/>
+        </w:rPr>
+        <w:t>| GET | `/library/catalog` | Optional Bearer → sets `owned` |</w:t>
+      </w:r>
+    </w:p>
+    <w:p>
+      <w:r>
+        <w:rPr>
+          <w:rFonts w:ascii="Consolas" w:hAnsi="Consolas"/>
+          <w:sz w:val="18"/>
+        </w:rPr>
+        <w:t>| GET | `/library/templates/:slug` | Optional Bearer |</w:t>
+      </w:r>
+    </w:p>
+    <w:p>
+      <w:r>
+        <w:rPr>
+          <w:rFonts w:ascii="Consolas" w:hAnsi="Consolas"/>
+          <w:sz w:val="18"/>
+        </w:rPr>
+        <w:t>| GET | `/library/templates/:slug/sample` | No (preview only) |</w:t>
+      </w:r>
+    </w:p>
+    <w:p>
+      <w:r>
+        <w:rPr>
+          <w:rFonts w:ascii="Consolas" w:hAnsi="Consolas"/>
+          <w:sz w:val="18"/>
+        </w:rPr>
+        <w:t>| **POST** | `/library/templates/:slug/purchase` | Client JWT |</w:t>
+      </w:r>
+    </w:p>
+    <w:p>
+      <w:r>
+        <w:rPr>
+          <w:rFonts w:ascii="Consolas" w:hAnsi="Consolas"/>
+          <w:sz w:val="18"/>
+        </w:rPr>
+        <w:t>| **POST** | `/library/purchases/:orderNumber/complete` | Client JWT |</w:t>
+      </w:r>
+    </w:p>
+    <w:p>
+      <w:r>
+        <w:rPr>
+          <w:rFonts w:ascii="Consolas" w:hAnsi="Consolas"/>
+          <w:sz w:val="18"/>
+        </w:rPr>
+        <w:t>| POST | `/library/coupons/validate` | No |</w:t>
+      </w:r>
+    </w:p>
+    <w:p>
+      <w:r>
+        <w:rPr>
+          <w:rFonts w:ascii="Consolas" w:hAnsi="Consolas"/>
+          <w:sz w:val="18"/>
+        </w:rPr>
+        <w:t>| POST | `/library/templates/:slug/download` | **410 Gone** |</w:t>
+      </w:r>
+    </w:p>
+    <w:p>
+      <w:pPr>
+        <w:pStyle w:val="Heading2"/>
+      </w:pPr>
+      <w:r>
+        <w:t>Purchase</w:t>
+      </w:r>
+    </w:p>
+    <w:p>
+      <w:r>
+        <w:rPr>
+          <w:rFonts w:ascii="Consolas" w:hAnsi="Consolas"/>
+          <w:sz w:val="18"/>
+        </w:rPr>
+        <w:t>POST /library/templates/:slug/purchase</w:t>
+      </w:r>
+    </w:p>
+    <w:p>
+      <w:r>
+        <w:t>Authorization: Bearer &lt;client&gt;</w:t>
+      </w:r>
+    </w:p>
+    <w:p>
+      <w:r>
+        <w:rPr>
+          <w:rFonts w:ascii="Consolas" w:hAnsi="Consolas"/>
+          <w:sz w:val="18"/>
+        </w:rPr>
+        <w:t>{ "couponCode": "WELCOME10" }</w:t>
+      </w:r>
+    </w:p>
+    <w:p>
+      <w:r>
+        <w:t>Response highlights:</w:t>
+      </w:r>
+    </w:p>
+    <w:p>
+      <w:r>
+        <w:t>- `paymentRequired: true` + `completeUrl`</w:t>
+      </w:r>
+    </w:p>
+    <w:p>
+      <w:r>
+        <w:t>- or `alreadyOwned: true` + `downloadUrl` under My Documents</w:t>
+      </w:r>
+    </w:p>
+    <w:p>
+      <w:r>
+        <w:t>- status stays `pending_payment` until complete</w:t>
+      </w:r>
+    </w:p>
+    <w:p>
+      <w:pPr>
+        <w:pStyle w:val="Heading2"/>
+      </w:pPr>
+      <w:r>
+        <w:t>Complete payment (demo / webhook substitute)</w:t>
+      </w:r>
+    </w:p>
+    <w:p>
+      <w:r>
+        <w:rPr>
+          <w:rFonts w:ascii="Consolas" w:hAnsi="Consolas"/>
+          <w:sz w:val="18"/>
+        </w:rPr>
+        <w:t>POST /library/purchases/:orderNumber/complete</w:t>
+      </w:r>
+    </w:p>
+    <w:p>
+      <w:r>
+        <w:t>Authorization: Bearer &lt;client&gt;</w:t>
       </w:r>
     </w:p>
     <w:p>
@@ -726,90 +706,17 @@
     </w:p>
     <w:p>
       <w:r>
-        <w:t xml:space="preserve">  "ok": true,</w:t>
+        <w:t xml:space="preserve">  "paymentMethod": "demo",</w:t>
       </w:r>
     </w:p>
     <w:p>
       <w:r>
-        <w:t xml:space="preserve">  "message": "Template downloaded and saved to My Documents",</w:t>
+        <w:t xml:space="preserve">  "paymentReference": "optional-ref",</w:t>
       </w:r>
     </w:p>
     <w:p>
       <w:r>
-        <w:t xml:space="preserve">  "document": {</w:t>
-      </w:r>
-    </w:p>
-    <w:p>
-      <w:r>
-        <w:rPr>
-          <w:rFonts w:ascii="Consolas" w:hAnsi="Consolas"/>
-          <w:sz w:val="18"/>
-        </w:rPr>
-        <w:t xml:space="preserve">    "orderNumber": "4821",</w:t>
-      </w:r>
-    </w:p>
-    <w:p>
-      <w:r>
-        <w:rPr>
-          <w:rFonts w:ascii="Consolas" w:hAnsi="Consolas"/>
-          <w:sz w:val="18"/>
-        </w:rPr>
-        <w:t xml:space="preserve">    "templateId": "nda-agreement",</w:t>
-      </w:r>
-    </w:p>
-    <w:p>
-      <w:r>
-        <w:rPr>
-          <w:rFonts w:ascii="Consolas" w:hAnsi="Consolas"/>
-          <w:sz w:val="18"/>
-        </w:rPr>
-        <w:t xml:space="preserve">    "templateName": "NDA Agreement",</w:t>
-      </w:r>
-    </w:p>
-    <w:p>
-      <w:r>
-        <w:rPr>
-          <w:rFonts w:ascii="Consolas" w:hAnsi="Consolas"/>
-          <w:sz w:val="18"/>
-        </w:rPr>
-        <w:t xml:space="preserve">    "status": "Completed",</w:t>
-      </w:r>
-    </w:p>
-    <w:p>
-      <w:r>
-        <w:rPr>
-          <w:rFonts w:ascii="Consolas" w:hAnsi="Consolas"/>
-          <w:sz w:val="18"/>
-        </w:rPr>
-        <w:t xml:space="preserve">    "statusKey": "completed",</w:t>
-      </w:r>
-    </w:p>
-    <w:p>
-      <w:r>
-        <w:rPr>
-          <w:rFonts w:ascii="Consolas" w:hAnsi="Consolas"/>
-          <w:sz w:val="18"/>
-        </w:rPr>
-        <w:t xml:space="preserve">    "source": "library_download",</w:t>
-      </w:r>
-    </w:p>
-    <w:p>
-      <w:r>
-        <w:rPr>
-          <w:rFonts w:ascii="Consolas" w:hAnsi="Consolas"/>
-          <w:sz w:val="18"/>
-        </w:rPr>
-        <w:t xml:space="preserve">    "downloadUrl": "/api/v2/documents/4821/download"</w:t>
-      </w:r>
-    </w:p>
-    <w:p>
-      <w:r>
-        <w:t xml:space="preserve">  },</w:t>
-      </w:r>
-    </w:p>
-    <w:p>
-      <w:r>
-        <w:t xml:space="preserve">  "downloadUrl": "/api/v2/documents/4821/download"</w:t>
+        <w:t xml:space="preserve">  "couponCode": "WELCOME10"</w:t>
       </w:r>
     </w:p>
     <w:p>
@@ -819,27 +726,38 @@
     </w:p>
     <w:p>
       <w:r>
-        <w:t>| Case | Document status |</w:t>
+        <w:t>Unlocks document (`status=completed`, `source=library_purchase`).</w:t>
+      </w:r>
+    </w:p>
+    <w:p>
+      <w:pPr>
+        <w:pStyle w:val="Heading2"/>
+      </w:pPr>
+      <w:r>
+        <w:t>Coupons (demo)</w:t>
       </w:r>
     </w:p>
     <w:p>
       <w:r>
-        <w:t>|------|-----------------|</w:t>
+        <w:rPr>
+          <w:rFonts w:ascii="Consolas" w:hAnsi="Consolas"/>
+          <w:sz w:val="18"/>
+        </w:rPr>
+        <w:t>POST /library/coupons/validate</w:t>
       </w:r>
     </w:p>
     <w:p>
       <w:r>
-        <w:t>| Template has an uploaded file | `Completed` — file ready via `downloadUrl` |</w:t>
+        <w:rPr>
+          <w:rFonts w:ascii="Consolas" w:hAnsi="Consolas"/>
+          <w:sz w:val="18"/>
+        </w:rPr>
+        <w:t>{ "code": "WELCOME10", "templateSlug": "affidavit" }</w:t>
       </w:r>
     </w:p>
     <w:p>
       <w:r>
-        <w:t>| Template has no file | `Pending Payment` — still appears in My Documents |</w:t>
-      </w:r>
-    </w:p>
-    <w:p>
-      <w:r>
-        <w:t>Catalog `downloadUrl` for paid items points at this POST endpoint.</w:t>
+        <w:t>Demo codes: `WELCOME10` (10%), `NEXUS20` (20%).</w:t>
       </w:r>
     </w:p>
     <w:p>
@@ -852,77 +770,57 @@
         <w:pStyle w:val="Heading1"/>
       </w:pPr>
       <w:r>
-        <w:t>5. My Documents APIs (changed behavior)</w:t>
+        <w:t>7. My Documents</w:t>
       </w:r>
     </w:p>
     <w:p>
       <w:r>
-        <w:t>| Method | Path | Auth | Purpose |</w:t>
+        <w:rPr>
+          <w:rFonts w:ascii="Consolas" w:hAnsi="Consolas"/>
+          <w:sz w:val="18"/>
+        </w:rPr>
+        <w:t>| Method | Path | Auth |</w:t>
       </w:r>
     </w:p>
     <w:p>
       <w:r>
-        <w:t>|--------|------|------|---------|</w:t>
+        <w:rPr>
+          <w:rFonts w:ascii="Consolas" w:hAnsi="Consolas"/>
+          <w:sz w:val="18"/>
+        </w:rPr>
+        <w:t>|--------|------|------|</w:t>
       </w:r>
     </w:p>
     <w:p>
       <w:r>
-        <w:t>| GET | `/documents` | Client JWT | List client documents (orders + library downloads) |</w:t>
+        <w:rPr>
+          <w:rFonts w:ascii="Consolas" w:hAnsi="Consolas"/>
+          <w:sz w:val="18"/>
+        </w:rPr>
+        <w:t>| GET | `/documents` | Client JWT |</w:t>
       </w:r>
     </w:p>
     <w:p>
       <w:r>
-        <w:t>| GET | `/documents/:orderNumber` | Client JWT | Document detail |</w:t>
+        <w:rPr>
+          <w:rFonts w:ascii="Consolas" w:hAnsi="Consolas"/>
+          <w:sz w:val="18"/>
+        </w:rPr>
+        <w:t>| GET | `/documents/:orderNumber` | Client JWT |</w:t>
       </w:r>
     </w:p>
     <w:p>
       <w:r>
-        <w:t>| GET | `/documents/:orderNumber/download` | Client JWT | Download file |</w:t>
+        <w:rPr>
+          <w:rFonts w:ascii="Consolas" w:hAnsi="Consolas"/>
+          <w:sz w:val="18"/>
+        </w:rPr>
+        <w:t>| GET | `/documents/:orderNumber/download` | Client JWT |</w:t>
       </w:r>
     </w:p>
     <w:p>
       <w:r>
-        <w:t xml:space="preserve">**Changed:**  </w:t>
-      </w:r>
-    </w:p>
-    <w:p>
-      <w:r>
-        <w:t xml:space="preserve">Documents now include library downloads (`source: "library_download"`).  </w:t>
-      </w:r>
-    </w:p>
-    <w:p>
-      <w:r>
-        <w:t>If the document came from a library file, download serves the stored template file (not only disk uploads / plain-text fallback).</w:t>
-      </w:r>
-    </w:p>
-    <w:p>
-      <w:r>
-        <w:t>Extra fields on document objects:</w:t>
-      </w:r>
-    </w:p>
-    <w:p>
-      <w:r>
-        <w:t>| Field | Notes |</w:t>
-      </w:r>
-    </w:p>
-    <w:p>
-      <w:r>
-        <w:t>|-------|--------|</w:t>
-      </w:r>
-    </w:p>
-    <w:p>
-      <w:r>
-        <w:t>| `source` | `library_download` \| `order` |</w:t>
-      </w:r>
-    </w:p>
-    <w:p>
-      <w:r>
-        <w:t>| `downloadUrl` | Present when file/status allows download |</w:t>
-      </w:r>
-    </w:p>
-    <w:p>
-      <w:r>
-        <w:t>| `hasDownload` | On list items |</w:t>
+        <w:t>Download of unpaid library purchases returns **402** with `completeUrl`.</w:t>
       </w:r>
     </w:p>
     <w:p>
@@ -935,12 +833,12 @@
         <w:pStyle w:val="Heading1"/>
       </w:pPr>
       <w:r>
-        <w:t>6. Custom orders (existing, clarified)</w:t>
+        <w:t>8. Admin APIs</w:t>
       </w:r>
     </w:p>
     <w:p>
       <w:r>
-        <w:t>For custom drafting (intake form), still use:</w:t>
+        <w:t>Auth: admin Bearer.</w:t>
       </w:r>
     </w:p>
     <w:p>
@@ -949,12 +847,7 @@
           <w:rFonts w:ascii="Consolas" w:hAnsi="Consolas"/>
           <w:sz w:val="18"/>
         </w:rPr>
-        <w:t>POST /orders</w:t>
-      </w:r>
-    </w:p>
-    <w:p>
-      <w:r>
-        <w:t>Authorization: Bearer &lt;client_token&gt;</w:t>
+        <w:t>| Method | Path |</w:t>
       </w:r>
     </w:p>
     <w:p>
@@ -963,42 +856,84 @@
           <w:rFonts w:ascii="Consolas" w:hAnsi="Consolas"/>
           <w:sz w:val="18"/>
         </w:rPr>
-        <w:t>{</w:t>
+        <w:t>|--------|------|</w:t>
       </w:r>
     </w:p>
     <w:p>
       <w:r>
-        <w:t xml:space="preserve">  "templateId": "moa",</w:t>
+        <w:rPr>
+          <w:rFonts w:ascii="Consolas" w:hAnsi="Consolas"/>
+          <w:sz w:val="18"/>
+        </w:rPr>
+        <w:t>| GET | `/admin/library/catalog` |</w:t>
       </w:r>
     </w:p>
     <w:p>
       <w:r>
-        <w:t xml:space="preserve">  "templateName": "Memorandum of Association",</w:t>
+        <w:rPr>
+          <w:rFonts w:ascii="Consolas" w:hAnsi="Consolas"/>
+          <w:sz w:val="18"/>
+        </w:rPr>
+        <w:t>| GET | `/admin/library/categories` |</w:t>
       </w:r>
     </w:p>
     <w:p>
       <w:r>
-        <w:t xml:space="preserve">  "formData": { "summary": "Need MOA for Pvt Ltd in Lahore" }</w:t>
+        <w:rPr>
+          <w:rFonts w:ascii="Consolas" w:hAnsi="Consolas"/>
+          <w:sz w:val="18"/>
+        </w:rPr>
+        <w:t>| POST | `/admin/library/categories` |</w:t>
       </w:r>
     </w:p>
     <w:p>
       <w:r>
-        <w:t>}</w:t>
+        <w:rPr>
+          <w:rFonts w:ascii="Consolas" w:hAnsi="Consolas"/>
+          <w:sz w:val="18"/>
+        </w:rPr>
+        <w:t>| PUT | `/admin/library/categories/:idOrSlug` |</w:t>
       </w:r>
     </w:p>
     <w:p>
       <w:r>
-        <w:t xml:space="preserve">- Only **paid** templates  </w:t>
+        <w:rPr>
+          <w:rFonts w:ascii="Consolas" w:hAnsi="Consolas"/>
+          <w:sz w:val="18"/>
+        </w:rPr>
+        <w:t>| DELETE | `/admin/library/categories/:idOrSlug` |</w:t>
       </w:r>
     </w:p>
     <w:p>
       <w:r>
-        <w:t xml:space="preserve">- Public Knowledge Bank templates **cannot** be ordered (400)  </w:t>
+        <w:rPr>
+          <w:rFonts w:ascii="Consolas" w:hAnsi="Consolas"/>
+          <w:sz w:val="18"/>
+        </w:rPr>
+        <w:t>| POST | `/admin/library/templates` (multipart) |</w:t>
       </w:r>
     </w:p>
     <w:p>
       <w:r>
-        <w:t>- Created document appears in `GET /documents` with status `Pending Payment`</w:t>
+        <w:rPr>
+          <w:rFonts w:ascii="Consolas" w:hAnsi="Consolas"/>
+          <w:sz w:val="18"/>
+        </w:rPr>
+        <w:t>| PUT | `/admin/library/templates/:idOrSlug` |</w:t>
+      </w:r>
+    </w:p>
+    <w:p>
+      <w:r>
+        <w:rPr>
+          <w:rFonts w:ascii="Consolas" w:hAnsi="Consolas"/>
+          <w:sz w:val="18"/>
+        </w:rPr>
+        <w:t>| DELETE | `/admin/library/templates/:idOrSlug` |</w:t>
+      </w:r>
+    </w:p>
+    <w:p>
+      <w:r>
+        <w:t>Template multipart fields: `name`, `accessType` (`public`|`paid`), `categorySlug`, `price`, `description`, `code`, `block`, `language`, `author`, `version`, `file`.</w:t>
       </w:r>
     </w:p>
     <w:p>
@@ -1011,77 +946,52 @@
         <w:pStyle w:val="Heading1"/>
       </w:pPr>
       <w:r>
-        <w:t>7. Frontend integration checklist</w:t>
+        <w:t>9. Acceptance checklist</w:t>
       </w:r>
     </w:p>
     <w:p>
       <w:r>
-        <w:t>1. **Admin UI**</w:t>
+        <w:t>- [x] Schema columns migrated on Vercel cold start (`is_active`, `description`, `access_type`, `code`, `block`, `language`, …)</w:t>
       </w:r>
     </w:p>
     <w:p>
       <w:r>
-        <w:t xml:space="preserve">   - Upload form includes `accessType` (`public` | `paid`)</w:t>
+        <w:t>- [x] `GET /knowledge-bank/catalog` → 200, public only</w:t>
       </w:r>
     </w:p>
     <w:p>
       <w:r>
-        <w:t xml:space="preserve">   - Paid requires `price &gt; 0`</w:t>
+        <w:t>- [x] `GET /library/catalog` → 200, paid only</w:t>
       </w:r>
     </w:p>
     <w:p>
       <w:r>
-        <w:t xml:space="preserve">   - Optional `file` attachment</w:t>
+        <w:t>- [x] Detail/sample → 200/404 (not schema 500)</w:t>
       </w:r>
     </w:p>
     <w:p>
       <w:r>
-        <w:t>2. **Knowledge Bank page**</w:t>
+        <w:t>- [x] Paid file cannot enter My Documents without payment complete</w:t>
       </w:r>
     </w:p>
     <w:p>
       <w:r>
-        <w:t xml:space="preserve">   - `GET /knowledge-bank/catalog`</w:t>
+        <w:t>- [x] Purchase + complete path exists</w:t>
       </w:r>
     </w:p>
     <w:p>
       <w:r>
-        <w:t xml:space="preserve">   - Download via `GET /knowledge-bank/templates/:slug/download`</w:t>
+        <w:t>- [x] `GET /documents` lists purchases; download when completed</w:t>
       </w:r>
     </w:p>
     <w:p>
       <w:r>
-        <w:t>3. **Client Library page**</w:t>
+        <w:t>- [x] Catalog JSON includes section-3 fields + `owned`</w:t>
       </w:r>
     </w:p>
     <w:p>
       <w:r>
-        <w:t xml:space="preserve">   - `GET /library/catalog`</w:t>
-      </w:r>
-    </w:p>
-    <w:p>
-      <w:r>
-        <w:t xml:space="preserve">   - On Download button: `POST /library/templates/:slug/download` with Bearer token</w:t>
-      </w:r>
-    </w:p>
-    <w:p>
-      <w:r>
-        <w:t xml:space="preserve">   - Then refresh My Documents or navigate using returned `document`</w:t>
-      </w:r>
-    </w:p>
-    <w:p>
-      <w:r>
-        <w:t>4. **My Documents page**</w:t>
-      </w:r>
-    </w:p>
-    <w:p>
-      <w:r>
-        <w:t xml:space="preserve">   - `GET /documents`</w:t>
-      </w:r>
-    </w:p>
-    <w:p>
-      <w:r>
-        <w:t xml:space="preserve">   - Re-download: `GET /documents/:orderNumber/download`</w:t>
+        <w:t>- [x] Admin upload with `accessType` works</w:t>
       </w:r>
     </w:p>
     <w:p>
@@ -1094,166 +1004,7 @@
         <w:pStyle w:val="Heading1"/>
       </w:pPr>
       <w:r>
-        <w:t>8. Env &amp; auth reminder</w:t>
-      </w:r>
-    </w:p>
-    <w:p>
-      <w:r>
-        <w:rPr>
-          <w:rFonts w:ascii="Consolas" w:hAnsi="Consolas"/>
-          <w:sz w:val="18"/>
-        </w:rPr>
-        <w:t>VITE_API_BASE_URL=https://nexus-lexis-backend-ql8w.vercel.app/api/v2</w:t>
-      </w:r>
-    </w:p>
-    <w:p>
-      <w:r>
-        <w:rPr>
-          <w:rFonts w:ascii="Consolas" w:hAnsi="Consolas"/>
-          <w:sz w:val="18"/>
-        </w:rPr>
-        <w:t>VITE_AUTH_API_URL=https://nexus-lexis-backend-45v4.vercel.app/api/auth</w:t>
-      </w:r>
-    </w:p>
-    <w:p>
-      <w:r>
-        <w:t>- Admin / client tokens come from Auth API login (`POST /api/auth/login`)</w:t>
-      </w:r>
-    </w:p>
-    <w:p>
-      <w:r>
-        <w:t>- Main API accepts the same JWT (`Authorization: Bearer ...`)</w:t>
-      </w:r>
-    </w:p>
-    <w:p>
-      <w:r>
-        <w:t>---</w:t>
-      </w:r>
-    </w:p>
-    <w:p>
-      <w:pPr>
-        <w:pStyle w:val="Heading1"/>
-      </w:pPr>
-      <w:r>
-        <w:t>9. Seeded examples</w:t>
-      </w:r>
-    </w:p>
-    <w:p>
-      <w:r>
-        <w:t>After deploy/seed:</w:t>
-      </w:r>
-    </w:p>
-    <w:p>
-      <w:r>
-        <w:t>- Existing corporate / property / document-services templates → **`paid`** (Client Library)</w:t>
-      </w:r>
-    </w:p>
-    <w:p>
-      <w:r>
-        <w:t>- Sample Knowledge Bank entries (`kb-sample-affidavit`, `kb-nda-overview`) → **`public`**</w:t>
-      </w:r>
-    </w:p>
-    <w:p>
-      <w:r>
-        <w:t>---</w:t>
-      </w:r>
-    </w:p>
-    <w:p>
-      <w:pPr>
-        <w:pStyle w:val="Heading1"/>
-      </w:pPr>
-      <w:r>
-        <w:t>10. API summary (added / changed)</w:t>
-      </w:r>
-    </w:p>
-    <w:p>
-      <w:r>
-        <w:t>| Status | Method | Path |</w:t>
-      </w:r>
-    </w:p>
-    <w:p>
-      <w:r>
-        <w:t>|--------|--------|------|</w:t>
-      </w:r>
-    </w:p>
-    <w:p>
-      <w:r>
-        <w:t>| **Added** | GET | `/admin/library/catalog` |</w:t>
-      </w:r>
-    </w:p>
-    <w:p>
-      <w:r>
-        <w:t>| **Added** | POST | `/admin/library/categories` |</w:t>
-      </w:r>
-    </w:p>
-    <w:p>
-      <w:r>
-        <w:t>| **Added** | POST | `/admin/library/templates` |</w:t>
-      </w:r>
-    </w:p>
-    <w:p>
-      <w:r>
-        <w:t>| **Added** | PUT | `/admin/library/templates/:idOrSlug` |</w:t>
-      </w:r>
-    </w:p>
-    <w:p>
-      <w:r>
-        <w:t>| **Added** | DELETE | `/admin/library/templates/:idOrSlug` |</w:t>
-      </w:r>
-    </w:p>
-    <w:p>
-      <w:r>
-        <w:t>| **Added** | GET | `/knowledge-bank/catalog` |</w:t>
-      </w:r>
-    </w:p>
-    <w:p>
-      <w:r>
-        <w:t>| **Added** | GET | `/knowledge-bank/templates/:slug` |</w:t>
-      </w:r>
-    </w:p>
-    <w:p>
-      <w:r>
-        <w:t>| **Added** | GET | `/knowledge-bank/templates/:slug/download` |</w:t>
-      </w:r>
-    </w:p>
-    <w:p>
-      <w:r>
-        <w:t>| **Added** | POST | `/library/templates/:slug/download` |</w:t>
-      </w:r>
-    </w:p>
-    <w:p>
-      <w:r>
-        <w:t>| **Changed** | GET | `/library/catalog` — returns **paid only** |</w:t>
-      </w:r>
-    </w:p>
-    <w:p>
-      <w:r>
-        <w:t>| **Changed** | GET | `/library/templates/:slug` — **paid only** |</w:t>
-      </w:r>
-    </w:p>
-    <w:p>
-      <w:r>
-        <w:t>| **Changed** | GET | `/documents` — includes library downloads |</w:t>
-      </w:r>
-    </w:p>
-    <w:p>
-      <w:r>
-        <w:t>| **Changed** | GET | `/documents/:orderNumber/download` — serves library template files |</w:t>
-      </w:r>
-    </w:p>
-    <w:p>
-      <w:r>
-        <w:t>| **Changed** | POST | `/orders` — rejects public templates; returns document-shaped payload |</w:t>
-      </w:r>
-    </w:p>
-    <w:p>
-      <w:r>
-        <w:t>---</w:t>
-      </w:r>
-    </w:p>
-    <w:p>
-      <w:r>
-        <w:t>*Owner: NexusLexis Engineering · Internal frontend handoff*</w:t>
+        <w:t>10. Custom drafting</w:t>
       </w:r>
     </w:p>
     <w:sectPr>

</xml_diff>

<commit_message>
Add shared offset pagination for Library, My Documents, and Admin catalog.
Paginate templates (Approach A flat documents[]) with page/limit defaults 1/12, filter-before-slice, and a common pagination meta object for frontend page controls.

Co-authored-by: Cursor <cursoragent@cursor.com>
</commit_message>
<xml_diff>
--- a/docs/Library_KnowledgeBank_Documents_API.docx
+++ b/docs/Library_KnowledgeBank_Documents_API.docx
@@ -17,17 +17,22 @@
     </w:p>
     <w:p>
       <w:r>
-        <w:t xml:space="preserve">**Version:** 2.0  </w:t>
+        <w:t xml:space="preserve">**Version:** 2.1  </w:t>
       </w:r>
     </w:p>
     <w:p>
       <w:r>
-        <w:t xml:space="preserve">**Updated:** 2026-08-07  </w:t>
+        <w:t xml:space="preserve">**Updated:** 2026-08-08  </w:t>
       </w:r>
     </w:p>
     <w:p>
       <w:r>
         <w:t xml:space="preserve">**Replaces:** NL-DOC-LIB-001 (download-without-payment flow removed)  </w:t>
+      </w:r>
+    </w:p>
+    <w:p>
+      <w:r>
+        <w:t xml:space="preserve">**Related CR:** NL-BE-CR-PAGINATION-001  </w:t>
       </w:r>
     </w:p>
     <w:p>
@@ -360,6 +365,214 @@
     <w:p>
       <w:r>
         <w:t>Query params on catalogs: `category`, `search`, `block`, `language` (or `lang`).</w:t>
+      </w:r>
+    </w:p>
+    <w:p>
+      <w:r>
+        <w:t>---</w:t>
+      </w:r>
+    </w:p>
+    <w:p>
+      <w:pPr>
+        <w:pStyle w:val="Heading1"/>
+      </w:pPr>
+      <w:r>
+        <w:t>3.1 Pagination (Library, My Documents, Admin catalog)</w:t>
+      </w:r>
+    </w:p>
+    <w:p>
+      <w:r>
+        <w:t>Shared contract on:</w:t>
+      </w:r>
+    </w:p>
+    <w:p>
+      <w:r>
+        <w:t>- `GET /library/catalog`</w:t>
+      </w:r>
+    </w:p>
+    <w:p>
+      <w:r>
+        <w:t>- `GET /documents`</w:t>
+      </w:r>
+    </w:p>
+    <w:p>
+      <w:r>
+        <w:t>- `GET /admin/library/catalog`</w:t>
+      </w:r>
+    </w:p>
+    <w:p>
+      <w:r>
+        <w:t>Knowledge Bank is **not** paginated in this version.</w:t>
+      </w:r>
+    </w:p>
+    <w:p>
+      <w:r>
+        <w:rPr>
+          <w:rFonts w:ascii="Consolas" w:hAnsi="Consolas"/>
+          <w:sz w:val="18"/>
+        </w:rPr>
+        <w:t>| Param | Default | Notes |</w:t>
+      </w:r>
+    </w:p>
+    <w:p>
+      <w:r>
+        <w:rPr>
+          <w:rFonts w:ascii="Consolas" w:hAnsi="Consolas"/>
+          <w:sz w:val="18"/>
+        </w:rPr>
+        <w:t>|-------|---------|--------|</w:t>
+      </w:r>
+    </w:p>
+    <w:p>
+      <w:r>
+        <w:rPr>
+          <w:rFonts w:ascii="Consolas" w:hAnsi="Consolas"/>
+          <w:sz w:val="18"/>
+        </w:rPr>
+        <w:t>| `page` | `1` | 1-based. `0` / negative → `1`. If `page &gt; totalPages`, clamped to last page. |</w:t>
+      </w:r>
+    </w:p>
+    <w:p>
+      <w:r>
+        <w:rPr>
+          <w:rFonts w:ascii="Consolas" w:hAnsi="Consolas"/>
+          <w:sz w:val="18"/>
+        </w:rPr>
+        <w:t>| `limit` | `12` | Allowed: `6`, `12`, `24`, `48`. Invalid → nearest allow-list or `12`. Max `48`. |</w:t>
+      </w:r>
+    </w:p>
+    <w:p>
+      <w:r>
+        <w:t>Always returned (even if `page`/`limit` omitted):</w:t>
+      </w:r>
+    </w:p>
+    <w:p>
+      <w:r>
+        <w:rPr>
+          <w:rFonts w:ascii="Consolas" w:hAnsi="Consolas"/>
+          <w:sz w:val="18"/>
+        </w:rPr>
+        <w:t>"pagination": {</w:t>
+      </w:r>
+    </w:p>
+    <w:p>
+      <w:r>
+        <w:t xml:space="preserve">  "page": 1,</w:t>
+      </w:r>
+    </w:p>
+    <w:p>
+      <w:r>
+        <w:t xml:space="preserve">  "limit": 12,</w:t>
+      </w:r>
+    </w:p>
+    <w:p>
+      <w:r>
+        <w:t xml:space="preserve">  "totalItems": 87,</w:t>
+      </w:r>
+    </w:p>
+    <w:p>
+      <w:r>
+        <w:t xml:space="preserve">  "totalPages": 8,</w:t>
+      </w:r>
+    </w:p>
+    <w:p>
+      <w:r>
+        <w:t xml:space="preserve">  "hasNext": true,</w:t>
+      </w:r>
+    </w:p>
+    <w:p>
+      <w:r>
+        <w:t xml:space="preserve">  "hasPrev": false</w:t>
+      </w:r>
+    </w:p>
+    <w:p>
+      <w:r>
+        <w:t>}</w:t>
+      </w:r>
+    </w:p>
+    <w:p>
+      <w:r>
+        <w:t>**Approach A (Library + Admin):** paginate **templates**, not categories.</w:t>
+      </w:r>
+    </w:p>
+    <w:p>
+      <w:r>
+        <w:t>- `documents` / `templates` = current page only (flat)</w:t>
+      </w:r>
+    </w:p>
+    <w:p>
+      <w:r>
+        <w:t>- `categories` = filter metadata (`slug`, `name`, `icon`, `templateCount`) — no nested page slice</w:t>
+      </w:r>
+    </w:p>
+    <w:p>
+      <w:r>
+        <w:t>- `templateCount` = `pagination.totalItems`</w:t>
+      </w:r>
+    </w:p>
+    <w:p>
+      <w:r>
+        <w:t>- Filters (`search`, `category`, `accessType`, `status`) apply **before** OFFSET/LIMIT</w:t>
+      </w:r>
+    </w:p>
+    <w:p>
+      <w:r>
+        <w:t>**My Documents:** `documents` = current page only. Sort newest first.</w:t>
+      </w:r>
+    </w:p>
+    <w:p>
+      <w:r>
+        <w:t>Examples:</w:t>
+      </w:r>
+    </w:p>
+    <w:p>
+      <w:r>
+        <w:rPr>
+          <w:rFonts w:ascii="Consolas" w:hAnsi="Consolas"/>
+          <w:sz w:val="18"/>
+        </w:rPr>
+        <w:t>GET /library/catalog?page=2&amp;limit=12&amp;category=document-services</w:t>
+      </w:r>
+    </w:p>
+    <w:p>
+      <w:r>
+        <w:rPr>
+          <w:rFonts w:ascii="Consolas" w:hAnsi="Consolas"/>
+          <w:sz w:val="18"/>
+        </w:rPr>
+        <w:t>GET /library/catalog?page=1&amp;limit=24&amp;search=nda</w:t>
+      </w:r>
+    </w:p>
+    <w:p>
+      <w:r>
+        <w:rPr>
+          <w:rFonts w:ascii="Consolas" w:hAnsi="Consolas"/>
+          <w:sz w:val="18"/>
+        </w:rPr>
+        <w:t>GET /documents?page=1&amp;limit=12&amp;status=completed</w:t>
+      </w:r>
+    </w:p>
+    <w:p>
+      <w:r>
+        <w:rPr>
+          <w:rFonts w:ascii="Consolas" w:hAnsi="Consolas"/>
+          <w:sz w:val="18"/>
+        </w:rPr>
+        <w:t>GET /admin/library/catalog?page=1&amp;limit=12&amp;accessType=public</w:t>
+      </w:r>
+    </w:p>
+    <w:p>
+      <w:r>
+        <w:rPr>
+          <w:rFonts w:ascii="Consolas" w:hAnsi="Consolas"/>
+          <w:sz w:val="18"/>
+        </w:rPr>
+        <w:t>GET /admin/library/catalog?page=3&amp;limit=24&amp;search=khula</w:t>
+      </w:r>
+    </w:p>
+    <w:p>
+      <w:r>
+        <w:t>Admin catalog also includes `counts: { paid, public, inactive }` for tabs.</w:t>
       </w:r>
     </w:p>
     <w:p>

</xml_diff>

<commit_message>
Publish Library API contract v2.2 for frontend (pagination + temp admin deletes).
Co-authored-by: Cursor <cursoragent@cursor.com>
</commit_message>
<xml_diff>
--- a/docs/Library_KnowledgeBank_Documents_API.docx
+++ b/docs/Library_KnowledgeBank_Documents_API.docx
@@ -5,9 +5,18 @@
     <w:p>
       <w:pPr>
         <w:pStyle w:val="Title"/>
+        <w:jc w:val="left"/>
       </w:pPr>
       <w:r>
-        <w:t>NexusLexis — Library, Knowledge Bank &amp; My Documents (API Contract)</w:t>
+        <w:t>NexusLexis — Library, Knowledge Bank &amp; My Documents</w:t>
+      </w:r>
+    </w:p>
+    <w:p>
+      <w:r>
+        <w:rPr>
+          <w:color w:val="555555"/>
+        </w:rPr>
+        <w:t>API Contract  ·  NL-DOC-LIB-002  ·  Version 2.2  ·  8 August 2026</w:t>
       </w:r>
     </w:p>
     <w:p>
@@ -17,7 +26,7 @@
     </w:p>
     <w:p>
       <w:r>
-        <w:t xml:space="preserve">**Version:** 2.1  </w:t>
+        <w:t xml:space="preserve">**Version:** 2.2  </w:t>
       </w:r>
     </w:p>
     <w:p>
@@ -51,7 +60,21 @@
     </w:p>
     <w:p>
       <w:r>
-        <w:t>---</w:t>
+        <w:rPr>
+          <w:rFonts w:ascii="Consolas" w:hAnsi="Consolas"/>
+          <w:sz w:val="18"/>
+        </w:rPr>
+        <w:t>VITE_AUTH_API_URL=https://nexus-lexis-backend-45v4.vercel.app/api/auth</w:t>
+      </w:r>
+    </w:p>
+    <w:p>
+      <w:r>
+        <w:t xml:space="preserve">Admin demo: `admin@nexuslexis.law` / `admin123`  </w:t>
+      </w:r>
+    </w:p>
+    <w:p>
+      <w:r>
+        <w:t>Client demo: `client@nexuslexis.law` / `password123`</w:t>
       </w:r>
     </w:p>
     <w:p>
@@ -59,9 +82,262 @@
         <w:pStyle w:val="Heading1"/>
       </w:pPr>
       <w:r>
-        <w:t>1. Product rules</w:t>
+        <w:t>0. What changed (send this to frontend)</w:t>
       </w:r>
     </w:p>
+    <w:p>
+      <w:pPr>
+        <w:pStyle w:val="Heading2"/>
+      </w:pPr>
+      <w:r>
+        <w:t>Added</w:t>
+      </w:r>
+    </w:p>
+    <w:p>
+      <w:r>
+        <w:rPr>
+          <w:rFonts w:ascii="Consolas" w:hAnsi="Consolas"/>
+          <w:sz w:val="18"/>
+        </w:rPr>
+        <w:t>| Method | Path | Notes |</w:t>
+      </w:r>
+    </w:p>
+    <w:p>
+      <w:r>
+        <w:rPr>
+          <w:rFonts w:ascii="Consolas" w:hAnsi="Consolas"/>
+          <w:sz w:val="18"/>
+        </w:rPr>
+        <w:t>|--------|------|--------|</w:t>
+      </w:r>
+    </w:p>
+    <w:p>
+      <w:r>
+        <w:rPr>
+          <w:rFonts w:ascii="Consolas" w:hAnsi="Consolas"/>
+          <w:sz w:val="18"/>
+        </w:rPr>
+        <w:t>| POST | `/library/templates/:slug/purchase` | Start buy (pending payment) |</w:t>
+      </w:r>
+    </w:p>
+    <w:p>
+      <w:r>
+        <w:rPr>
+          <w:rFonts w:ascii="Consolas" w:hAnsi="Consolas"/>
+          <w:sz w:val="18"/>
+        </w:rPr>
+        <w:t>| POST | `/library/purchases/:orderNumber/complete` | Complete pay → unlock My Documents |</w:t>
+      </w:r>
+    </w:p>
+    <w:p>
+      <w:r>
+        <w:rPr>
+          <w:rFonts w:ascii="Consolas" w:hAnsi="Consolas"/>
+          <w:sz w:val="18"/>
+        </w:rPr>
+        <w:t>| POST | `/library/coupons/validate` | Demo coupons `WELCOME10`, `NEXUS20` |</w:t>
+      </w:r>
+    </w:p>
+    <w:p>
+      <w:r>
+        <w:rPr>
+          <w:rFonts w:ascii="Consolas" w:hAnsi="Consolas"/>
+          <w:sz w:val="18"/>
+        </w:rPr>
+        <w:t>| GET | `/knowledge-bank/catalog` | Public templates only |</w:t>
+      </w:r>
+    </w:p>
+    <w:p>
+      <w:r>
+        <w:rPr>
+          <w:rFonts w:ascii="Consolas" w:hAnsi="Consolas"/>
+          <w:sz w:val="18"/>
+        </w:rPr>
+        <w:t>| GET | `/knowledge-bank/templates/:slug` | Public detail |</w:t>
+      </w:r>
+    </w:p>
+    <w:p>
+      <w:r>
+        <w:rPr>
+          <w:rFonts w:ascii="Consolas" w:hAnsi="Consolas"/>
+          <w:sz w:val="18"/>
+        </w:rPr>
+        <w:t>| GET | `/knowledge-bank/templates/:slug/download` | Free download (not My Documents) |</w:t>
+      </w:r>
+    </w:p>
+    <w:p>
+      <w:r>
+        <w:rPr>
+          <w:rFonts w:ascii="Consolas" w:hAnsi="Consolas"/>
+          <w:sz w:val="18"/>
+        </w:rPr>
+        <w:t>| GET | `/library/templates/:slug/sample` | Paid preview only |</w:t>
+      </w:r>
+    </w:p>
+    <w:p>
+      <w:r>
+        <w:rPr>
+          <w:rFonts w:ascii="Consolas" w:hAnsi="Consolas"/>
+          <w:sz w:val="18"/>
+        </w:rPr>
+        <w:t>| GET/POST/PUT/DELETE | `/admin/library/categories` | Admin category CRUD |</w:t>
+      </w:r>
+    </w:p>
+    <w:p>
+      <w:r>
+        <w:rPr>
+          <w:rFonts w:ascii="Consolas" w:hAnsi="Consolas"/>
+          <w:sz w:val="18"/>
+        </w:rPr>
+        <w:t>| POST/PUT/DELETE | `/admin/library/templates` | Admin template upload (`accessType`) |</w:t>
+      </w:r>
+    </w:p>
+    <w:p>
+      <w:r>
+        <w:rPr>
+          <w:rFonts w:ascii="Consolas" w:hAnsi="Consolas"/>
+          <w:sz w:val="18"/>
+        </w:rPr>
+        <w:t>| GET | `/admin/library/catalog` | Admin catalog + pagination + `counts` |</w:t>
+      </w:r>
+    </w:p>
+    <w:p>
+      <w:r>
+        <w:rPr>
+          <w:rFonts w:ascii="Consolas" w:hAnsi="Consolas"/>
+          <w:sz w:val="18"/>
+        </w:rPr>
+        <w:t>| GET | `/admin/documents` | **TEMP** list purchases (testing) |</w:t>
+      </w:r>
+    </w:p>
+    <w:p>
+      <w:r>
+        <w:rPr>
+          <w:rFonts w:ascii="Consolas" w:hAnsi="Consolas"/>
+          <w:sz w:val="18"/>
+        </w:rPr>
+        <w:t>| DELETE | `/admin/documents/:orderNumber` | **TEMP** hard-delete My Documents row |</w:t>
+      </w:r>
+    </w:p>
+    <w:p>
+      <w:r>
+        <w:rPr>
+          <w:rFonts w:ascii="Consolas" w:hAnsi="Consolas"/>
+          <w:sz w:val="18"/>
+        </w:rPr>
+        <w:t>| DELETE | `/admin/library/templates/:slug?hard=true` | **TEMP** hard-delete template + purchases |</w:t>
+      </w:r>
+    </w:p>
+    <w:p>
+      <w:pPr>
+        <w:pStyle w:val="Heading2"/>
+      </w:pPr>
+      <w:r>
+        <w:t>Updated</w:t>
+      </w:r>
+    </w:p>
+    <w:p>
+      <w:r>
+        <w:rPr>
+          <w:rFonts w:ascii="Consolas" w:hAnsi="Consolas"/>
+          <w:sz w:val="18"/>
+        </w:rPr>
+        <w:t>| Method | Path | Change |</w:t>
+      </w:r>
+    </w:p>
+    <w:p>
+      <w:r>
+        <w:rPr>
+          <w:rFonts w:ascii="Consolas" w:hAnsi="Consolas"/>
+          <w:sz w:val="18"/>
+        </w:rPr>
+        <w:t>|--------|------|--------|</w:t>
+      </w:r>
+    </w:p>
+    <w:p>
+      <w:r>
+        <w:rPr>
+          <w:rFonts w:ascii="Consolas" w:hAnsi="Consolas"/>
+          <w:sz w:val="18"/>
+        </w:rPr>
+        <w:t>| GET | `/library/catalog` | Paid only + field contract + `owned` + **pagination** + flat `documents[]` |</w:t>
+      </w:r>
+    </w:p>
+    <w:p>
+      <w:r>
+        <w:rPr>
+          <w:rFonts w:ascii="Consolas" w:hAnsi="Consolas"/>
+          <w:sz w:val="18"/>
+        </w:rPr>
+        <w:t>| GET | `/library/templates/:slug` | Paid only + field contract + `owned` |</w:t>
+      </w:r>
+    </w:p>
+    <w:p>
+      <w:r>
+        <w:rPr>
+          <w:rFonts w:ascii="Consolas" w:hAnsi="Consolas"/>
+          <w:sz w:val="18"/>
+        </w:rPr>
+        <w:t>| GET | `/documents` | Includes library purchases + **pagination** + `counts` |</w:t>
+      </w:r>
+    </w:p>
+    <w:p>
+      <w:r>
+        <w:rPr>
+          <w:rFonts w:ascii="Consolas" w:hAnsi="Consolas"/>
+          <w:sz w:val="18"/>
+        </w:rPr>
+        <w:t>| GET | `/documents/:orderNumber/download` | Serves purchased library file; **402** if unpaid |</w:t>
+      </w:r>
+    </w:p>
+    <w:p>
+      <w:r>
+        <w:rPr>
+          <w:rFonts w:ascii="Consolas" w:hAnsi="Consolas"/>
+          <w:sz w:val="18"/>
+        </w:rPr>
+        <w:t>| POST | `/library/templates/:slug/download` | **410 Gone** — do not use |</w:t>
+      </w:r>
+    </w:p>
+    <w:p>
+      <w:pPr>
+        <w:pStyle w:val="Heading2"/>
+      </w:pPr>
+      <w:r>
+        <w:t>Pagination (Library, My Documents, Admin catalog)</w:t>
+      </w:r>
+    </w:p>
+    <w:p/>
+    <w:p>
+      <w:r>
+        <w:rPr>
+          <w:rFonts w:ascii="Consolas" w:hAnsi="Consolas"/>
+          <w:sz w:val="18"/>
+        </w:rPr>
+        <w:t>"pagination": { "page": 1, "limit": 12, "totalItems": 87, "totalPages": 8, "hasNext": true, "hasPrev": false }</w:t>
+      </w:r>
+    </w:p>
+    <w:p/>
+    <w:p>
+      <w:r>
+        <w:rPr>
+          <w:rFonts w:ascii="Consolas" w:hAnsi="Consolas"/>
+          <w:sz w:val="18"/>
+        </w:rPr>
+        <w:t>---</w:t>
+      </w:r>
+    </w:p>
+    <w:p/>
+    <w:p>
+      <w:r>
+        <w:rPr>
+          <w:rFonts w:ascii="Consolas" w:hAnsi="Consolas"/>
+          <w:sz w:val="18"/>
+        </w:rPr>
+        <w:t>## 1. Product rules</w:t>
+      </w:r>
+    </w:p>
+    <w:p/>
     <w:p>
       <w:r>
         <w:rPr>
@@ -98,67 +374,113 @@
         <w:t>| Paid | `paid` | Client Library | Login → **Buy** → **Pay** → unlock in My Documents → download **only** from My Documents. |</w:t>
       </w:r>
     </w:p>
+    <w:p/>
     <w:p>
       <w:r>
+        <w:rPr>
+          <w:rFonts w:ascii="Consolas" w:hAnsi="Consolas"/>
+          <w:sz w:val="18"/>
+        </w:rPr>
         <w:t>**Removed:** `POST /library/templates/:slug/download` no longer unlocks paid files without payment (returns `410`).</w:t>
       </w:r>
     </w:p>
+    <w:p/>
     <w:p>
       <w:r>
+        <w:rPr>
+          <w:rFonts w:ascii="Consolas" w:hAnsi="Consolas"/>
+          <w:sz w:val="18"/>
+        </w:rPr>
         <w:t>---</w:t>
       </w:r>
     </w:p>
+    <w:p/>
     <w:p>
-      <w:pPr>
-        <w:pStyle w:val="Heading1"/>
-      </w:pPr>
       <w:r>
-        <w:t>2. Target purchase flow (paid Library)</w:t>
+        <w:rPr>
+          <w:rFonts w:ascii="Consolas" w:hAnsi="Consolas"/>
+          <w:sz w:val="18"/>
+        </w:rPr>
+        <w:t>## 2. Target purchase flow (paid Library)</w:t>
       </w:r>
     </w:p>
+    <w:p/>
     <w:p>
       <w:r>
+        <w:rPr>
+          <w:rFonts w:ascii="Consolas" w:hAnsi="Consolas"/>
+          <w:sz w:val="18"/>
+        </w:rPr>
         <w:t>1. `GET /library/catalog` — show paid docs (`owned` when Bearer present).</w:t>
       </w:r>
     </w:p>
     <w:p>
       <w:r>
+        <w:rPr>
+          <w:rFonts w:ascii="Consolas" w:hAnsi="Consolas"/>
+          <w:sz w:val="18"/>
+        </w:rPr>
         <w:t>2. `POST /library/templates/:slug/purchase` — create pending purchase.</w:t>
       </w:r>
     </w:p>
     <w:p>
       <w:r>
+        <w:rPr>
+          <w:rFonts w:ascii="Consolas" w:hAnsi="Consolas"/>
+          <w:sz w:val="18"/>
+        </w:rPr>
         <w:t>3. `POST /library/purchases/:orderNumber/complete` — mark paid / unlock.</w:t>
       </w:r>
     </w:p>
     <w:p>
       <w:r>
+        <w:rPr>
+          <w:rFonts w:ascii="Consolas" w:hAnsi="Consolas"/>
+          <w:sz w:val="18"/>
+        </w:rPr>
         <w:t>4. `GET /documents` — purchased doc appears.</w:t>
       </w:r>
     </w:p>
     <w:p>
       <w:r>
+        <w:rPr>
+          <w:rFonts w:ascii="Consolas" w:hAnsi="Consolas"/>
+          <w:sz w:val="18"/>
+        </w:rPr>
         <w:t>5. `GET /documents/:orderNumber/download` — download file (completed only).</w:t>
       </w:r>
     </w:p>
+    <w:p/>
     <w:p>
       <w:r>
+        <w:rPr>
+          <w:rFonts w:ascii="Consolas" w:hAnsi="Consolas"/>
+          <w:sz w:val="18"/>
+        </w:rPr>
         <w:t>Knowledge Bank stays: catalog → free `GET .../download` (no My Documents).</w:t>
       </w:r>
     </w:p>
+    <w:p/>
     <w:p>
       <w:r>
+        <w:rPr>
+          <w:rFonts w:ascii="Consolas" w:hAnsi="Consolas"/>
+          <w:sz w:val="18"/>
+        </w:rPr>
         <w:t>---</w:t>
       </w:r>
     </w:p>
+    <w:p/>
     <w:p>
-      <w:pPr>
-        <w:pStyle w:val="Heading1"/>
-      </w:pPr>
       <w:r>
-        <w:t>3. Response field contract (templates)</w:t>
+        <w:rPr>
+          <w:rFonts w:ascii="Consolas" w:hAnsi="Consolas"/>
+          <w:sz w:val="18"/>
+        </w:rPr>
+        <w:t>## 3. Response field contract (templates)</w:t>
       </w:r>
     </w:p>
+    <w:p/>
     <w:p>
       <w:r>
         <w:rPr>
@@ -303,11 +625,17 @@
         <w:t>| Actions | `purchaseUrl`, `sampleDownloadUrl`, `downloadUrl` |</w:t>
       </w:r>
     </w:p>
+    <w:p/>
     <w:p>
       <w:r>
+        <w:rPr>
+          <w:rFonts w:ascii="Consolas" w:hAnsi="Consolas"/>
+          <w:sz w:val="18"/>
+        </w:rPr>
         <w:t>Catalog also returns:</w:t>
       </w:r>
     </w:p>
+    <w:p/>
     <w:p>
       <w:r>
         <w:rPr>
@@ -362,49 +690,85 @@
         <w:t>}</w:t>
       </w:r>
     </w:p>
+    <w:p/>
     <w:p>
       <w:r>
+        <w:rPr>
+          <w:rFonts w:ascii="Consolas" w:hAnsi="Consolas"/>
+          <w:sz w:val="18"/>
+        </w:rPr>
         <w:t>Query params on catalogs: `category`, `search`, `block`, `language` (or `lang`).</w:t>
       </w:r>
     </w:p>
+    <w:p/>
     <w:p>
       <w:r>
+        <w:rPr>
+          <w:rFonts w:ascii="Consolas" w:hAnsi="Consolas"/>
+          <w:sz w:val="18"/>
+        </w:rPr>
         <w:t>---</w:t>
       </w:r>
     </w:p>
+    <w:p/>
     <w:p>
-      <w:pPr>
-        <w:pStyle w:val="Heading1"/>
-      </w:pPr>
       <w:r>
-        <w:t>3.1 Pagination (Library, My Documents, Admin catalog)</w:t>
+        <w:rPr>
+          <w:rFonts w:ascii="Consolas" w:hAnsi="Consolas"/>
+          <w:sz w:val="18"/>
+        </w:rPr>
+        <w:t>## 3.1 Pagination (Library, My Documents, Admin catalog)</w:t>
       </w:r>
     </w:p>
+    <w:p/>
     <w:p>
       <w:r>
+        <w:rPr>
+          <w:rFonts w:ascii="Consolas" w:hAnsi="Consolas"/>
+          <w:sz w:val="18"/>
+        </w:rPr>
         <w:t>Shared contract on:</w:t>
       </w:r>
     </w:p>
+    <w:p/>
     <w:p>
       <w:r>
+        <w:rPr>
+          <w:rFonts w:ascii="Consolas" w:hAnsi="Consolas"/>
+          <w:sz w:val="18"/>
+        </w:rPr>
         <w:t>- `GET /library/catalog`</w:t>
       </w:r>
     </w:p>
     <w:p>
       <w:r>
+        <w:rPr>
+          <w:rFonts w:ascii="Consolas" w:hAnsi="Consolas"/>
+          <w:sz w:val="18"/>
+        </w:rPr>
         <w:t>- `GET /documents`</w:t>
       </w:r>
     </w:p>
     <w:p>
       <w:r>
+        <w:rPr>
+          <w:rFonts w:ascii="Consolas" w:hAnsi="Consolas"/>
+          <w:sz w:val="18"/>
+        </w:rPr>
         <w:t>- `GET /admin/library/catalog`</w:t>
       </w:r>
     </w:p>
+    <w:p/>
     <w:p>
       <w:r>
+        <w:rPr>
+          <w:rFonts w:ascii="Consolas" w:hAnsi="Consolas"/>
+          <w:sz w:val="18"/>
+        </w:rPr>
         <w:t>Knowledge Bank is **not** paginated in this version.</w:t>
       </w:r>
     </w:p>
+    <w:p/>
     <w:p>
       <w:r>
         <w:rPr>
@@ -441,11 +805,17 @@
         <w:t>| `limit` | `12` | Allowed: `6`, `12`, `24`, `48`. Invalid → nearest allow-list or `12`. Max `48`. |</w:t>
       </w:r>
     </w:p>
+    <w:p/>
     <w:p>
       <w:r>
+        <w:rPr>
+          <w:rFonts w:ascii="Consolas" w:hAnsi="Consolas"/>
+          <w:sz w:val="18"/>
+        </w:rPr>
         <w:t>Always returned (even if `page`/`limit` omitted):</w:t>
       </w:r>
     </w:p>
+    <w:p/>
     <w:p>
       <w:r>
         <w:rPr>
@@ -490,41 +860,74 @@
         <w:t>}</w:t>
       </w:r>
     </w:p>
+    <w:p/>
     <w:p>
       <w:r>
+        <w:rPr>
+          <w:rFonts w:ascii="Consolas" w:hAnsi="Consolas"/>
+          <w:sz w:val="18"/>
+        </w:rPr>
         <w:t>**Approach A (Library + Admin):** paginate **templates**, not categories.</w:t>
       </w:r>
     </w:p>
+    <w:p/>
     <w:p>
       <w:r>
+        <w:rPr>
+          <w:rFonts w:ascii="Consolas" w:hAnsi="Consolas"/>
+          <w:sz w:val="18"/>
+        </w:rPr>
         <w:t>- `documents` / `templates` = current page only (flat)</w:t>
       </w:r>
     </w:p>
     <w:p>
       <w:r>
+        <w:rPr>
+          <w:rFonts w:ascii="Consolas" w:hAnsi="Consolas"/>
+          <w:sz w:val="18"/>
+        </w:rPr>
         <w:t>- `categories` = filter metadata (`slug`, `name`, `icon`, `templateCount`) — no nested page slice</w:t>
       </w:r>
     </w:p>
     <w:p>
       <w:r>
+        <w:rPr>
+          <w:rFonts w:ascii="Consolas" w:hAnsi="Consolas"/>
+          <w:sz w:val="18"/>
+        </w:rPr>
         <w:t>- `templateCount` = `pagination.totalItems`</w:t>
       </w:r>
     </w:p>
     <w:p>
       <w:r>
+        <w:rPr>
+          <w:rFonts w:ascii="Consolas" w:hAnsi="Consolas"/>
+          <w:sz w:val="18"/>
+        </w:rPr>
         <w:t>- Filters (`search`, `category`, `accessType`, `status`) apply **before** OFFSET/LIMIT</w:t>
       </w:r>
     </w:p>
+    <w:p/>
     <w:p>
       <w:r>
+        <w:rPr>
+          <w:rFonts w:ascii="Consolas" w:hAnsi="Consolas"/>
+          <w:sz w:val="18"/>
+        </w:rPr>
         <w:t>**My Documents:** `documents` = current page only. Sort newest first.</w:t>
       </w:r>
     </w:p>
+    <w:p/>
     <w:p>
       <w:r>
+        <w:rPr>
+          <w:rFonts w:ascii="Consolas" w:hAnsi="Consolas"/>
+          <w:sz w:val="18"/>
+        </w:rPr>
         <w:t>Examples:</w:t>
       </w:r>
     </w:p>
+    <w:p/>
     <w:p>
       <w:r>
         <w:rPr>
@@ -570,24 +973,37 @@
         <w:t>GET /admin/library/catalog?page=3&amp;limit=24&amp;search=khula</w:t>
       </w:r>
     </w:p>
+    <w:p/>
     <w:p>
       <w:r>
+        <w:rPr>
+          <w:rFonts w:ascii="Consolas" w:hAnsi="Consolas"/>
+          <w:sz w:val="18"/>
+        </w:rPr>
         <w:t>Admin catalog also includes `counts: { paid, public, inactive }` for tabs.</w:t>
       </w:r>
     </w:p>
+    <w:p/>
     <w:p>
       <w:r>
+        <w:rPr>
+          <w:rFonts w:ascii="Consolas" w:hAnsi="Consolas"/>
+          <w:sz w:val="18"/>
+        </w:rPr>
         <w:t>---</w:t>
       </w:r>
     </w:p>
+    <w:p/>
     <w:p>
-      <w:pPr>
-        <w:pStyle w:val="Heading1"/>
-      </w:pPr>
       <w:r>
-        <w:t>4. My Documents field contract</w:t>
+        <w:rPr>
+          <w:rFonts w:ascii="Consolas" w:hAnsi="Consolas"/>
+          <w:sz w:val="18"/>
+        </w:rPr>
+        <w:t>## 4. My Documents field contract</w:t>
       </w:r>
     </w:p>
+    <w:p/>
     <w:p>
       <w:r>
         <w:rPr>
@@ -678,19 +1094,27 @@
         <w:t>| Category | `category`, `categorySlug`, `categoryName` |</w:t>
       </w:r>
     </w:p>
+    <w:p/>
     <w:p>
       <w:r>
+        <w:rPr>
+          <w:rFonts w:ascii="Consolas" w:hAnsi="Consolas"/>
+          <w:sz w:val="18"/>
+        </w:rPr>
         <w:t>---</w:t>
       </w:r>
     </w:p>
+    <w:p/>
     <w:p>
-      <w:pPr>
-        <w:pStyle w:val="Heading1"/>
-      </w:pPr>
       <w:r>
-        <w:t>5. Public Knowledge Bank</w:t>
+        <w:rPr>
+          <w:rFonts w:ascii="Consolas" w:hAnsi="Consolas"/>
+          <w:sz w:val="18"/>
+        </w:rPr>
+        <w:t>## 5. Public Knowledge Bank</w:t>
       </w:r>
     </w:p>
+    <w:p/>
     <w:p>
       <w:r>
         <w:rPr>
@@ -736,24 +1160,37 @@
         <w:t>| GET | `/knowledge-bank/templates/:slug/download` | No |</w:t>
       </w:r>
     </w:p>
+    <w:p/>
     <w:p>
       <w:r>
+        <w:rPr>
+          <w:rFonts w:ascii="Consolas" w:hAnsi="Consolas"/>
+          <w:sz w:val="18"/>
+        </w:rPr>
         <w:t>Returns **only** `accessType=public` and active templates.</w:t>
       </w:r>
     </w:p>
+    <w:p/>
     <w:p>
       <w:r>
+        <w:rPr>
+          <w:rFonts w:ascii="Consolas" w:hAnsi="Consolas"/>
+          <w:sz w:val="18"/>
+        </w:rPr>
         <w:t>---</w:t>
       </w:r>
     </w:p>
+    <w:p/>
     <w:p>
-      <w:pPr>
-        <w:pStyle w:val="Heading1"/>
-      </w:pPr>
       <w:r>
-        <w:t>6. Client Library (paid)</w:t>
+        <w:rPr>
+          <w:rFonts w:ascii="Consolas" w:hAnsi="Consolas"/>
+          <w:sz w:val="18"/>
+        </w:rPr>
+        <w:t>## 6. Client Library (paid)</w:t>
       </w:r>
     </w:p>
+    <w:p/>
     <w:p>
       <w:r>
         <w:rPr>
@@ -835,14 +1272,17 @@
         <w:t>| POST | `/library/templates/:slug/download` | **410 Gone** |</w:t>
       </w:r>
     </w:p>
+    <w:p/>
     <w:p>
-      <w:pPr>
-        <w:pStyle w:val="Heading2"/>
-      </w:pPr>
       <w:r>
-        <w:t>Purchase</w:t>
+        <w:rPr>
+          <w:rFonts w:ascii="Consolas" w:hAnsi="Consolas"/>
+          <w:sz w:val="18"/>
+        </w:rPr>
+        <w:t>### Purchase</w:t>
       </w:r>
     </w:p>
+    <w:p/>
     <w:p>
       <w:r>
         <w:rPr>
@@ -866,34 +1306,55 @@
         <w:t>{ "couponCode": "WELCOME10" }</w:t>
       </w:r>
     </w:p>
+    <w:p/>
     <w:p>
       <w:r>
+        <w:rPr>
+          <w:rFonts w:ascii="Consolas" w:hAnsi="Consolas"/>
+          <w:sz w:val="18"/>
+        </w:rPr>
         <w:t>Response highlights:</w:t>
       </w:r>
     </w:p>
+    <w:p/>
     <w:p>
       <w:r>
+        <w:rPr>
+          <w:rFonts w:ascii="Consolas" w:hAnsi="Consolas"/>
+          <w:sz w:val="18"/>
+        </w:rPr>
         <w:t>- `paymentRequired: true` + `completeUrl`</w:t>
       </w:r>
     </w:p>
     <w:p>
       <w:r>
+        <w:rPr>
+          <w:rFonts w:ascii="Consolas" w:hAnsi="Consolas"/>
+          <w:sz w:val="18"/>
+        </w:rPr>
         <w:t>- or `alreadyOwned: true` + `downloadUrl` under My Documents</w:t>
       </w:r>
     </w:p>
     <w:p>
       <w:r>
+        <w:rPr>
+          <w:rFonts w:ascii="Consolas" w:hAnsi="Consolas"/>
+          <w:sz w:val="18"/>
+        </w:rPr>
         <w:t>- status stays `pending_payment` until complete</w:t>
       </w:r>
     </w:p>
+    <w:p/>
     <w:p>
-      <w:pPr>
-        <w:pStyle w:val="Heading2"/>
-      </w:pPr>
       <w:r>
-        <w:t>Complete payment (demo / webhook substitute)</w:t>
+        <w:rPr>
+          <w:rFonts w:ascii="Consolas" w:hAnsi="Consolas"/>
+          <w:sz w:val="18"/>
+        </w:rPr>
+        <w:t>### Complete payment (demo / webhook substitute)</w:t>
       </w:r>
     </w:p>
+    <w:p/>
     <w:p>
       <w:r>
         <w:rPr>
@@ -937,19 +1398,27 @@
         <w:t>}</w:t>
       </w:r>
     </w:p>
+    <w:p/>
     <w:p>
       <w:r>
+        <w:rPr>
+          <w:rFonts w:ascii="Consolas" w:hAnsi="Consolas"/>
+          <w:sz w:val="18"/>
+        </w:rPr>
         <w:t>Unlocks document (`status=completed`, `source=library_purchase`).</w:t>
       </w:r>
     </w:p>
+    <w:p/>
     <w:p>
-      <w:pPr>
-        <w:pStyle w:val="Heading2"/>
-      </w:pPr>
       <w:r>
-        <w:t>Coupons (demo)</w:t>
+        <w:rPr>
+          <w:rFonts w:ascii="Consolas" w:hAnsi="Consolas"/>
+          <w:sz w:val="18"/>
+        </w:rPr>
+        <w:t>### Coupons (demo)</w:t>
       </w:r>
     </w:p>
+    <w:p/>
     <w:p>
       <w:r>
         <w:rPr>
@@ -968,24 +1437,37 @@
         <w:t>{ "code": "WELCOME10", "templateSlug": "affidavit" }</w:t>
       </w:r>
     </w:p>
+    <w:p/>
     <w:p>
       <w:r>
+        <w:rPr>
+          <w:rFonts w:ascii="Consolas" w:hAnsi="Consolas"/>
+          <w:sz w:val="18"/>
+        </w:rPr>
         <w:t>Demo codes: `WELCOME10` (10%), `NEXUS20` (20%).</w:t>
       </w:r>
     </w:p>
+    <w:p/>
     <w:p>
       <w:r>
+        <w:rPr>
+          <w:rFonts w:ascii="Consolas" w:hAnsi="Consolas"/>
+          <w:sz w:val="18"/>
+        </w:rPr>
         <w:t>---</w:t>
       </w:r>
     </w:p>
+    <w:p/>
     <w:p>
-      <w:pPr>
-        <w:pStyle w:val="Heading1"/>
-      </w:pPr>
       <w:r>
-        <w:t>7. My Documents</w:t>
+        <w:rPr>
+          <w:rFonts w:ascii="Consolas" w:hAnsi="Consolas"/>
+          <w:sz w:val="18"/>
+        </w:rPr>
+        <w:t>## 7. My Documents</w:t>
       </w:r>
     </w:p>
+    <w:p/>
     <w:p>
       <w:r>
         <w:rPr>
@@ -1031,14 +1513,10 @@
         <w:t>| GET | `/documents/:orderNumber/download` | Client JWT |</w:t>
       </w:r>
     </w:p>
+    <w:p/>
     <w:p>
       <w:r>
         <w:t>Download of unpaid library purchases returns **402** with `completeUrl`.</w:t>
-      </w:r>
-    </w:p>
-    <w:p>
-      <w:r>
-        <w:t>---</w:t>
       </w:r>
     </w:p>
     <w:p>
@@ -1150,8 +1628,66 @@
       </w:r>
     </w:p>
     <w:p>
+      <w:pPr>
+        <w:pStyle w:val="Heading2"/>
+      </w:pPr>
       <w:r>
-        <w:t>---</w:t>
+        <w:t>Temporary testing deletes (remove after QA)</w:t>
+      </w:r>
+    </w:p>
+    <w:p>
+      <w:r>
+        <w:t>Admin Bearer required. Marked `temporaryTestingApi: true`.</w:t>
+      </w:r>
+    </w:p>
+    <w:p>
+      <w:r>
+        <w:rPr>
+          <w:rFonts w:ascii="Consolas" w:hAnsi="Consolas"/>
+          <w:sz w:val="18"/>
+        </w:rPr>
+        <w:t>| Method | Path | Purpose |</w:t>
+      </w:r>
+    </w:p>
+    <w:p>
+      <w:r>
+        <w:rPr>
+          <w:rFonts w:ascii="Consolas" w:hAnsi="Consolas"/>
+          <w:sz w:val="18"/>
+        </w:rPr>
+        <w:t>|--------|------|---------|</w:t>
+      </w:r>
+    </w:p>
+    <w:p>
+      <w:r>
+        <w:rPr>
+          <w:rFonts w:ascii="Consolas" w:hAnsi="Consolas"/>
+          <w:sz w:val="18"/>
+        </w:rPr>
+        <w:t>| GET | `/admin/documents` | List recent purchases across clients |</w:t>
+      </w:r>
+    </w:p>
+    <w:p>
+      <w:r>
+        <w:rPr>
+          <w:rFonts w:ascii="Consolas" w:hAnsi="Consolas"/>
+          <w:sz w:val="18"/>
+        </w:rPr>
+        <w:t>| DELETE | `/admin/documents/:orderNumber` | Hard-delete one My Documents row |</w:t>
+      </w:r>
+    </w:p>
+    <w:p>
+      <w:r>
+        <w:rPr>
+          <w:rFonts w:ascii="Consolas" w:hAnsi="Consolas"/>
+          <w:sz w:val="18"/>
+        </w:rPr>
+        <w:t>| DELETE | `/admin/library/templates/:idOrSlug?hard=true` | Hard-delete template + its purchases |</w:t>
+      </w:r>
+    </w:p>
+    <w:p>
+      <w:r>
+        <w:t>Normal `DELETE /admin/library/templates/:idOrSlug` (no `hard`) still only deactivates.</w:t>
       </w:r>
     </w:p>
     <w:p>
@@ -1208,11 +1744,6 @@
       </w:r>
     </w:p>
     <w:p>
-      <w:r>
-        <w:t>---</w:t>
-      </w:r>
-    </w:p>
-    <w:p>
       <w:pPr>
         <w:pStyle w:val="Heading1"/>
       </w:pPr>
@@ -1222,7 +1753,7 @@
     </w:p>
     <w:sectPr>
       <w:pgSz w:w="12240" w:h="15840"/>
-      <w:pgMar w:top="1440" w:right="1800" w:bottom="1440" w:left="1800" w:header="720" w:footer="720" w:gutter="0"/>
+      <w:pgMar w:top="1152" w:right="1296" w:bottom="1152" w:left="1296" w:header="720" w:footer="720" w:gutter="0"/>
       <w:cols w:space="720"/>
       <w:docGrid w:linePitch="360"/>
     </w:sectPr>

</xml_diff>